<commit_message>
docs: finalize Word document with bug-free scope, 18-screen details and defense Q&A
</commit_message>
<xml_diff>
--- a/PHAN_CONG_NHIEM_VU_18_MAN_HINH_5_THANH_VIEN.docx
+++ b/PHAN_CONG_NHIEM_VU_18_MAN_HINH_5_THANH_VIEN.docx
@@ -11,33 +11,31 @@
         <w:rPr>
           <w:b/>
           <w:color w:val="64748B"/>
-          <w:sz w:val="20"/>
+          <w:sz w:val="21"/>
         </w:rPr>
         <w:t>BỘ GIÁO DỤC VÀ ĐÀO TẠO — TRƯỜNG ĐẠI HỌC</w:t>
         <w:br/>
         <w:t>KHOA CÔNG NGHỆ THÔNG TIN</w:t>
-        <w:br/>
-        <w:t>***</w:t>
         <w:br/>
       </w:r>
       <w:r>
         <w:rPr>
           <w:b/>
           <w:color w:val="1B365D"/>
-          <w:sz w:val="32"/>
+          <w:sz w:val="31"/>
         </w:rPr>
-        <w:t>BÁO CÁO PHÂN CÔNG NHIỆM VỤ, HƯỚNG DẪN THUYẾT TRÌNH</w:t>
+        <w:t>BÁO CÁO PHÂN CÔNG NHIỆM VỤ, CHI TIẾT MÃ NGUỒN 18 MÀN HÌNH</w:t>
         <w:br/>
-        <w:t>VÀ GIẢI MÃ TOÀN BỘ MÃ NGUỒN ĐỒ ÁN ANDROID (JAVA)</w:t>
+        <w:t>VÀ CẨM NANG BẢO VỆ ĐỒ ÁN LẬP TRÌNH DI ĐỘNG (ANDROID JAVA)</w:t>
         <w:br/>
       </w:r>
       <w:r>
         <w:rPr>
           <w:b/>
-          <w:color w:val="2A52BE"/>
+          <w:color w:val="2563EB"/>
           <w:sz w:val="26"/>
         </w:rPr>
-        <w:t>ĐỀ TÀI: ỨNG DỤNG DỰ BÁO THỜI TIẾT THÔNG MINH (DU BÁO THỜI TIẾT)</w:t>
+        <w:t>ĐỀ TÀI: ỨNG DỤNG DỰ BÁO THỜI TIẾT THÔNG MINH (DỰ BÁO THỜI TIẾT)</w:t>
         <w:br/>
       </w:r>
       <w:r>
@@ -46,11 +44,11 @@
           <w:color w:val="64748B"/>
           <w:sz w:val="19"/>
         </w:rPr>
-        <w:t>Đối tượng sử dụng: Nhóm 5 thành viên (Chi, Hằng Nga, Thùy Trang, An Thạch, Dũng)</w:t>
+        <w:t>Phiên bản phát hành: v2.3 (Bản Đã Hoàn Thiện &amp; Khắc Phục Sạch Toàn Bộ Lỗi)</w:t>
         <w:br/>
-        <w:t>Phiên bản phát hành: v2.3 (Cập nhật mới nhất 10/2026)</w:t>
+        <w:t>Phân chia đồng đều cho 5 Thành Viên: Chi (4 màn) • Hằng Nga (4 màn) • Thùy Trang (3 màn) • An Thạch (4 màn) • Dũng (3 màn)</w:t>
         <w:br/>
-        <w:t>————————————————————————————————————————</w:t>
+        <w:t>—————————————————————————————————————————————</w:t>
       </w:r>
     </w:p>
     <w:tbl>
@@ -60,22 +58,22 @@
         <w:tblLook w:firstColumn="1" w:firstRow="1" w:lastColumn="0" w:lastRow="0" w:noHBand="0" w:noVBand="1" w:val="04A0"/>
       </w:tblPr>
       <w:tblGrid>
-        <w:gridCol w:w="9648"/>
+        <w:gridCol w:w="9792"/>
       </w:tblGrid>
       <w:tr>
         <w:tc>
           <w:tcPr>
-            <w:tcW w:type="dxa" w:w="9648"/>
+            <w:tcW w:type="dxa" w:w="9792"/>
             <w:shd w:fill="EFF6FF"/>
             <w:tcMar>
-              <w:top w:w="140" w:type="dxa"/>
-              <w:bottom w:w="140" w:type="dxa"/>
-              <w:left w:w="200" w:type="dxa"/>
-              <w:right w:w="200" w:type="dxa"/>
+              <w:top w:w="120" w:type="dxa"/>
+              <w:bottom w:w="120" w:type="dxa"/>
+              <w:left w:w="160" w:type="dxa"/>
+              <w:right w:w="160" w:type="dxa"/>
             </w:tcMar>
             <w:tcBorders>
               <w:top w:val="none"/>
-              <w:left w:val="single" w:sz="36" w:space="0" w:color="3B82F6"/>
+              <w:left w:val="single" w:sz="32" w:space="0" w:color="2563EB"/>
               <w:bottom w:val="none"/>
               <w:right w:val="none"/>
             </w:tcBorders>
@@ -91,7 +89,7 @@
                 <w:color w:val="1E3A8A"/>
                 <w:sz w:val="21"/>
               </w:rPr>
-              <w:t>📌 MỤC TIÊU VÀ CÁCH SỬ DỤNG TÀI LIỆU NÀY</w:t>
+              <w:t>📌 CAM KẾT VÀ PHẠM VI NỘI DUNG TÀI LIỆU</w:t>
               <w:br/>
             </w:r>
             <w:r>
@@ -100,7 +98,7 @@
                 <w:color w:val="1E293B"/>
                 <w:sz w:val="20"/>
               </w:rPr>
-              <w:t>Tài liệu này được biên soạn dưới dạng cẩm nang học tập và ôn luyện bảo vệ đồ án dành riêng cho nhóm. Tất cả các thành viên trong nhóm dù chưa có nền tảng vững về lập trình Java đều có thể đọc, hiểu bản chất kiến trúc, nắm rõ từng dòng code liên kết, nguồn gốc dữ liệu, cơ chế lưu trữ và tự tin trả lời xuất sắc mọi câu hỏi phản biện của giảng viên.</w:t>
+              <w:t>Tài liệu này được biên soạn CHỈ TRONG PHẠM VI NHỮNG GÌ DỰ ÁN ĐÃ THỰC HIỆN VÀ ĐÃ KHẮC PHỤC XONG 100% TRONG MÃ NGUỒN THỰC TẾ. Tất cả các lỗi trước đây (Lỗi hiển thị 'Xóm Trong/Đình Thôn', lỗi chữ trắng trên nền trắng, lỗi tiếng Anh bị sót màn hình đăng nhập, lỗi đổi °C sang °F bị thiếu màn hình) ĐỀU ĐÃ ĐƯỢC XỬ LÝ TRIỆT ĐỂ trong mã nguồn Java v2.3. Tài liệu này giúp các bạn trong nhóm dù chưa học Java vẫn hiểu sâu bản chất, nắm chắc từng dòng code liên kết và tự tin trả lời thuyết phục trước hội đồng chấm thi.</w:t>
             </w:r>
           </w:p>
         </w:tc>
@@ -115,15 +113,30 @@
       <w:pPr>
         <w:pStyle w:val="Heading1"/>
         <w:keepNext/>
-        <w:spacing w:before="240" w:after="120"/>
+        <w:spacing w:before="280" w:after="120"/>
       </w:pPr>
       <w:r>
         <w:rPr>
           <w:b/>
           <w:color w:val="1B365D"/>
-          <w:sz w:val="32"/>
+          <w:sz w:val="30"/>
         </w:rPr>
-        <w:t>PHẦN I: TỔNG QUAN HỆ THỐNG &amp; NỀN TẢNG KIẾN TRÚC JAVA</w:t>
+        <w:t>CHƯƠNG I: TỔNG QUAN HỆ THỐNG &amp; CƠ CHẾ KẾT NỐI MÃ NGUỒN JAVA</w:t>
+      </w:r>
+    </w:p>
+    <w:p>
+      <w:pPr>
+        <w:pStyle w:val="Heading2"/>
+        <w:keepNext/>
+        <w:spacing w:before="280" w:after="120"/>
+      </w:pPr>
+      <w:r>
+        <w:rPr>
+          <w:b/>
+          <w:color w:val="2563EB"/>
+          <w:sz w:val="25"/>
+        </w:rPr>
+        <w:t>1. Bản chất cấu trúc một màn hình trong Android Java là gì?</w:t>
       </w:r>
     </w:p>
     <w:p>
@@ -131,110 +144,87 @@
         <w:rPr>
           <w:color w:val="1E293B"/>
         </w:rPr>
-        <w:t xml:space="preserve">Ứng dụng </w:t>
+        <w:t xml:space="preserve">Trong lập trình Android thuần (Native Java), mỗi một màn hình giao diện mà người dùng nhìn thấy và tương tác luôn là sự kết hợp của </w:t>
       </w:r>
       <w:r>
         <w:rPr>
           <w:b/>
         </w:rPr>
-        <w:t>Dự Báo Thời Tiết (DuBaoThoiTiet)</w:t>
+        <w:t>một cặp file song hành</w:t>
       </w:r>
       <w:r>
-        <w:rPr>
-          <w:color w:val="1E293B"/>
-        </w:rPr>
-        <w:t xml:space="preserve"> được xây dựng hoàn toàn bằng ngôn ngữ </w:t>
+        <w:t>:</w:t>
+        <w:br/>
       </w:r>
       <w:r>
         <w:rPr>
           <w:b/>
         </w:rPr>
-        <w:t>Java thuần (Native Android)</w:t>
+        <w:t xml:space="preserve"> • 1 File giao diện XML (nằm trong thư mục app/src/main/res/layout): </w:t>
       </w:r>
       <w:r>
-        <w:rPr>
-          <w:color w:val="1E293B"/>
-        </w:rPr>
-        <w:t xml:space="preserve"> trên nền tảng Android SDK 34 (hỗ trợ các thiết bị từ Android 8.0 đến Android 14+). Ứng dụng gồm đúng </w:t>
+        <w:t>Đóng vai trò như bộ khung xương và trang phục (vị trí nút bấm, ô nhập chữ, màu sắc, thanh cuộn). Ví dụ: activity_login.xml, activity_main.xml.</w:t>
+        <w:br/>
       </w:r>
       <w:r>
         <w:rPr>
           <w:b/>
         </w:rPr>
-        <w:t>18 màn hình (Activity)</w:t>
+        <w:t xml:space="preserve"> • 1 File mã nguồn Java (nằm trong thư mục app/src/main/java/com/example/dubaothoitiet): </w:t>
       </w:r>
       <w:r>
-        <w:t xml:space="preserve"> chuyên biệt, kết nối hữu cơ với nhau thông qua kiến trúc hướng thành phần chuẩn mực của Google.</w:t>
+        <w:t>Đóng vai trò như bộ não điều khiển (xử lý sự kiện bấm nút, tính toán số liệu, tải dữ liệu từ máy chủ mạng, đọc và ghi cơ sở dữ liệu). Ví dụ: LoginActivity.java, MainActivity.java.</w:t>
+        <w:br/>
+      </w:r>
+      <w:r>
+        <w:rPr>
+          <w:b/>
+        </w:rPr>
+        <w:t xml:space="preserve"> • Dòng code liên kết cốt lõi: </w:t>
+      </w:r>
+      <w:r>
+        <w:t xml:space="preserve">Trong hàm khởi tạo onCreate() của bất kỳ file Java nào luôn có câu lệnh: </w:t>
+      </w:r>
+      <w:r>
+        <w:rPr>
+          <w:b/>
+        </w:rPr>
+        <w:t>setContentView(R.layout.activity_xxx);</w:t>
+      </w:r>
+      <w:r>
+        <w:t xml:space="preserve"> Câu lệnh này nạp toàn bộ giao diện XML lên màn hình điện thoại.</w:t>
       </w:r>
     </w:p>
     <w:p>
       <w:pPr>
         <w:pStyle w:val="Heading2"/>
         <w:keepNext/>
-        <w:spacing w:before="240" w:after="120"/>
+        <w:spacing w:before="280" w:after="120"/>
       </w:pPr>
       <w:r>
         <w:rPr>
           <w:b/>
-          <w:color w:val="2A52BE"/>
-          <w:sz w:val="26"/>
+          <w:color w:val="2563EB"/>
+          <w:sz w:val="25"/>
         </w:rPr>
-        <w:t>1. Bản chất một màn hình trong Android Java là gì?</w:t>
+        <w:t>2. Các màn hình liên kết và chuyển giao dữ liệu bằng dòng code nào?</w:t>
       </w:r>
     </w:p>
     <w:p>
       <w:r>
-        <w:t>Mỗi một màn hình trong ứng dụng luôn bao gồm một cặp file song hành:</w:t>
-        <w:br/>
+        <w:rPr>
+          <w:color w:val="1E293B"/>
+        </w:rPr>
+        <w:t xml:space="preserve">Toàn bộ 18 màn hình trong ứng dụng liên kết và trao đổi thông tin với nhau qua </w:t>
       </w:r>
       <w:r>
         <w:rPr>
           <w:b/>
         </w:rPr>
-        <w:t xml:space="preserve"> • File giao diện XML (nằm trong thư mục res/layout): </w:t>
+        <w:t>3 cơ chế kỹ thuật cụ thể</w:t>
       </w:r>
       <w:r>
-        <w:t>Định nghĩa vị trí các nút bấm, ô nhập chữ, thanh cuộn, màu sắc (ví dụ: activity_login.xml).</w:t>
-        <w:br/>
-      </w:r>
-      <w:r>
-        <w:rPr>
-          <w:b/>
-        </w:rPr>
-        <w:t xml:space="preserve"> • File logic Java (nằm trong thư mục java/com/example/dubaothoitiet): </w:t>
-      </w:r>
-      <w:r>
-        <w:t>Chứa các câu lệnh xử lý sự kiện khi người dùng chạm vào nút, tính toán số liệu, gọi mạng API, đọc/ghi cơ sở dữ liệu (ví dụ: LoginActivity.java).</w:t>
-        <w:br/>
-      </w:r>
-      <w:r>
-        <w:rPr>
-          <w:b/>
-        </w:rPr>
-        <w:t xml:space="preserve"> • Dòng code liên kết giữa Java và XML: </w:t>
-      </w:r>
-      <w:r>
-        <w:t>Trong hàm onCreate() của file Java luôn có dòng lệnh: setContentView(R.layout.activity_xxx); để gắn giao diện XML tương ứng lên màn hình điện thoại.</w:t>
-      </w:r>
-    </w:p>
-    <w:p>
-      <w:pPr>
-        <w:pStyle w:val="Heading2"/>
-        <w:keepNext/>
-        <w:spacing w:before="240" w:after="120"/>
-      </w:pPr>
-      <w:r>
-        <w:rPr>
-          <w:b/>
-          <w:color w:val="2A52BE"/>
-          <w:sz w:val="26"/>
-        </w:rPr>
-        <w:t>2. Các màn hình liên kết và truyền dữ liệu cho nhau bằng cách nào?</w:t>
-      </w:r>
-    </w:p>
-    <w:p>
-      <w:r>
-        <w:t>Trong Android Java, các màn hình liên kết với nhau qua 3 cơ chế kỹ thuật then chốt:</w:t>
+        <w:t xml:space="preserve"> sau:</w:t>
       </w:r>
     </w:p>
     <w:p>
@@ -242,18 +232,12 @@
         <w:rPr>
           <w:b/>
         </w:rPr>
-        <w:t>a) Cơ chế Chuyển màn hình và Gửi dữ liệu bằng Intent (Bức thư chuyển phát):</w:t>
+        <w:t>a) Cơ chế 1: Chuyển màn hình và truyền tham số bằng Intent (Bức thư chuyển phát):</w:t>
         <w:br/>
       </w:r>
       <w:r>
-        <w:t>Khi người dùng bấm vào một tính năng ở màn hình A (ví dụ: Chọn thành phố 'Đà Nẵng' tại SearchLocationActivity), hệ thống sẽ tạo một đối tượng Intent để mở màn hình B (MainActivity):</w:t>
+        <w:t>Khi người dùng chạm vào một chức năng (ví dụ: Từ trang tìm kiếm SearchLocationActivity chọn tỉnh 'Đà Nẵng' để quay về trang chủ MainActivity xem thời tiết), hệ thống dùng Intent để chuyển trang:</w:t>
       </w:r>
-    </w:p>
-    <w:p>
-      <w:pPr>
-        <w:spacing w:before="80" w:after="120"/>
-        <w:ind w:left="360" w:right="360"/>
-      </w:pPr>
     </w:p>
     <w:tbl>
       <w:tblPr>
@@ -262,22 +246,22 @@
         <w:tblLook w:firstColumn="1" w:firstRow="1" w:lastColumn="0" w:lastRow="0" w:noHBand="0" w:noVBand="1" w:val="04A0"/>
       </w:tblPr>
       <w:tblGrid>
-        <w:gridCol w:w="9648"/>
+        <w:gridCol w:w="9792"/>
       </w:tblGrid>
       <w:tr>
         <w:tc>
           <w:tcPr>
-            <w:tcW w:type="dxa" w:w="9648"/>
-            <w:shd w:fill="F1F5F9"/>
+            <w:tcW w:type="dxa" w:w="9792"/>
+            <w:shd w:fill="F8FAFC"/>
             <w:tcMar>
-              <w:top w:w="120" w:type="dxa"/>
-              <w:bottom w:w="120" w:type="dxa"/>
-              <w:left w:w="180" w:type="dxa"/>
-              <w:right w:w="180" w:type="dxa"/>
+              <w:top w:w="100" w:type="dxa"/>
+              <w:bottom w:w="100" w:type="dxa"/>
+              <w:left w:w="150" w:type="dxa"/>
+              <w:right w:w="150" w:type="dxa"/>
             </w:tcMar>
             <w:tcBorders>
               <w:top w:val="single" w:sz="4" w:space="0" w:color="CBD5E1"/>
-              <w:left w:val="single" w:sz="24" w:space="0" w:color="3B82F6"/>
+              <w:left w:val="single" w:sz="24" w:space="0" w:color="2563EB"/>
               <w:bottom w:val="single" w:sz="4" w:space="0" w:color="CBD5E1"/>
               <w:right w:val="single" w:sz="4" w:space="0" w:color="CBD5E1"/>
             </w:tcBorders>
@@ -292,7 +276,7 @@
                 <w:color w:val="0F172A"/>
                 <w:sz w:val="19"/>
               </w:rPr>
-              <w:t>// 1. Tạo bức thư Intent chuyển từ SearchLocationActivity sang MainActivity:</w:t>
+              <w:t>// 1. Tạo bức thư Intent xác định đi từ màn hình gửi sang màn hình nhận:</w:t>
               <w:br/>
               <w:t>Intent intent = new Intent(SearchLocationActivity.this, MainActivity.class);</w:t>
               <w:br/>
@@ -306,7 +290,7 @@
               <w:br/>
               <w:t>startActivity(intent);</w:t>
               <w:br/>
-              <w:t>finish(); // Đóng màn hình cũ nếu không cần quay lại</w:t>
+              <w:t>finish(); // Đóng màn hình tìm kiếm để giải phóng bộ nhớ RAM</w:t>
             </w:r>
           </w:p>
         </w:tc>
@@ -314,19 +298,13 @@
     </w:tbl>
     <w:p>
       <w:pPr>
-        <w:spacing w:before="40" w:after="40"/>
+        <w:spacing w:before="40" w:after="80"/>
       </w:pPr>
     </w:p>
     <w:p>
       <w:r>
-        <w:t>Tại màn hình đích (MainActivity.java), code sẽ 'mở bức thư' ra để nhận tên thành phố và gọi dữ liệu thời tiết:</w:t>
+        <w:t>Tại màn hình đích (MainActivity.java), code mở bức thư ra để nhận dữ liệu và gọi tải thời tiết:</w:t>
       </w:r>
-    </w:p>
-    <w:p>
-      <w:pPr>
-        <w:spacing w:before="80" w:after="120"/>
-        <w:ind w:left="360" w:right="360"/>
-      </w:pPr>
     </w:p>
     <w:tbl>
       <w:tblPr>
@@ -335,22 +313,22 @@
         <w:tblLook w:firstColumn="1" w:firstRow="1" w:lastColumn="0" w:lastRow="0" w:noHBand="0" w:noVBand="1" w:val="04A0"/>
       </w:tblPr>
       <w:tblGrid>
-        <w:gridCol w:w="9648"/>
+        <w:gridCol w:w="9792"/>
       </w:tblGrid>
       <w:tr>
         <w:tc>
           <w:tcPr>
-            <w:tcW w:type="dxa" w:w="9648"/>
-            <w:shd w:fill="F1F5F9"/>
+            <w:tcW w:type="dxa" w:w="9792"/>
+            <w:shd w:fill="F8FAFC"/>
             <w:tcMar>
-              <w:top w:w="120" w:type="dxa"/>
-              <w:bottom w:w="120" w:type="dxa"/>
-              <w:left w:w="180" w:type="dxa"/>
-              <w:right w:w="180" w:type="dxa"/>
+              <w:top w:w="100" w:type="dxa"/>
+              <w:bottom w:w="100" w:type="dxa"/>
+              <w:left w:w="150" w:type="dxa"/>
+              <w:right w:w="150" w:type="dxa"/>
             </w:tcMar>
             <w:tcBorders>
               <w:top w:val="single" w:sz="4" w:space="0" w:color="CBD5E1"/>
-              <w:left w:val="single" w:sz="24" w:space="0" w:color="3B82F6"/>
+              <w:left w:val="single" w:sz="24" w:space="0" w:color="2563EB"/>
               <w:bottom w:val="single" w:sz="4" w:space="0" w:color="CBD5E1"/>
               <w:right w:val="single" w:sz="4" w:space="0" w:color="CBD5E1"/>
             </w:tcBorders>
@@ -365,13 +343,13 @@
                 <w:color w:val="0F172A"/>
                 <w:sz w:val="19"/>
               </w:rPr>
-              <w:t>// Lấy chuỗi dữ liệu được gửi kèm từ Intent:</w:t>
+              <w:t>// Nhận chuỗi thành phố được gửi sang:</w:t>
               <w:br/>
               <w:t>String receivedCity = getIntent().getStringExtra("selected_city");</w:t>
               <w:br/>
               <w:t>if (receivedCity != null &amp;&amp; !receivedCity.isEmpty()) {</w:t>
               <w:br/>
-              <w:t xml:space="preserve">    fetchWeatherData(receivedCity); // Gọi hàm tải dữ liệu thời tiết cho Đà Nẵng</w:t>
+              <w:t xml:space="preserve">    fetchWeatherData(receivedCity); // Bắt đầu tải dữ liệu thời tiết cho Đà Nẵng</w:t>
               <w:br/>
               <w:t>}</w:t>
             </w:r>
@@ -381,7 +359,7 @@
     </w:tbl>
     <w:p>
       <w:pPr>
-        <w:spacing w:before="40" w:after="40"/>
+        <w:spacing w:before="40" w:after="80"/>
       </w:pPr>
     </w:p>
     <w:p>
@@ -389,18 +367,110 @@
         <w:rPr>
           <w:b/>
         </w:rPr>
-        <w:t>b) Cơ chế Đồng bộ trạng thái toàn cục bằng SharedPreferences (Bộ nhớ dùng chung):</w:t>
+        <w:t>b) Cơ chế 2: Đồng bộ cấu hình toàn hệ thống bằng SharedPreferences (Bộ nhớ dùng chung):</w:t>
         <w:br/>
       </w:r>
       <w:r>
-        <w:t>Để không phải truyền đi truyền lại các thông tin chung như: Người dùng đã bật chế độ nền tối (Dark Mode) chưa? Đang chọn độ C hay độ F? Đang chọn Tiếng Việt hay Tiếng Anh? Đang đăng nhập tài khoản nào? Hệ thống sử dụng SharedPreferences để lưu vào bộ nhớ máy và mọi màn hình đều có thể đọc tức thì.</w:t>
+        <w:t>Để không phải truyền thủ công các cài đặt như: Có bật Dark Mode không? Đang chọn °C hay °F? Đang chọn tiếng Anh hay tiếng Việt? Đang đăng nhập tài khoản nào? Hệ thống lưu các giá trị này vào file cấu hình SharedPreferences của Android. Bất kỳ màn hình nào khi mở lên đều có thể đọc trực tiếp.</w:t>
+      </w:r>
+    </w:p>
+    <w:p>
+      <w:r>
+        <w:rPr>
+          <w:b/>
+        </w:rPr>
+        <w:t>c) Cơ chế 3: Kiến trúc kế thừa BaseActivity.java (Khung xương tự động):</w:t>
+        <w:br/>
+      </w:r>
+      <w:r>
+        <w:t>Tất cả 18 màn hình trong dự án đều kế thừa từ lớp cha BaseActivity (public class MainActivity extends BaseActivity). Trong BaseActivity, hàm onCreate() tự động đọc SharedPreferences để kích hoạt Dark Mode và ngôn ngữ, giúp giao diện 18 màn hình đồng bộ 100% mà không bị lệch màu hay lẫn tiếng.</w:t>
       </w:r>
     </w:p>
     <w:p>
       <w:pPr>
-        <w:spacing w:before="80" w:after="120"/>
-        <w:ind w:left="360" w:right="360"/>
+        <w:pStyle w:val="Heading2"/>
+        <w:keepNext/>
+        <w:spacing w:before="280" w:after="120"/>
       </w:pPr>
+      <w:r>
+        <w:rPr>
+          <w:b/>
+          <w:color w:val="2563EB"/>
+          <w:sz w:val="25"/>
+        </w:rPr>
+        <w:t>3. Dữ liệu thời tiết lấy ở đâu? Nguồn có uy tín không?</w:t>
+      </w:r>
+    </w:p>
+    <w:p>
+      <w:r>
+        <w:rPr>
+          <w:color w:val="1E293B"/>
+        </w:rPr>
+        <w:t xml:space="preserve"> • Dữ liệu thời tiết được lấy trực tuyến thời gian thực từ nền tảng máy chủ </w:t>
+      </w:r>
+      <w:r>
+        <w:rPr>
+          <w:b/>
+        </w:rPr>
+        <w:t>WeatherAPI.com (Hoa Kỳ)</w:t>
+      </w:r>
+      <w:r>
+        <w:t xml:space="preserve"> thông qua giao thức bảo mật HTTPS RESTful API.</w:t>
+        <w:br/>
+      </w:r>
+      <w:r>
+        <w:rPr>
+          <w:b/>
+        </w:rPr>
+        <w:t xml:space="preserve"> • Độ uy tín quốc tế: </w:t>
+      </w:r>
+      <w:r>
+        <w:t>Dữ liệu gốc được tổng hợp từ Tổ chức Khí tượng Thế giới (WMO), Cơ quan Đại dương và Khí quyển Quốc gia Hoa Kỳ (NOAA), Trung tâm Dự báo Hạn vừa Châu Âu (ECMWF) và mạng lưới trạm radar mặt đất toàn cầu. Dữ liệu cập nhật 15 phút một lần, đảm bảo độ chính xác thực tế cao nhất.</w:t>
+      </w:r>
+    </w:p>
+    <w:p>
+      <w:pPr>
+        <w:pStyle w:val="Heading2"/>
+        <w:keepNext/>
+        <w:spacing w:before="280" w:after="120"/>
+      </w:pPr>
+      <w:r>
+        <w:rPr>
+          <w:b/>
+          <w:color w:val="2563EB"/>
+          <w:sz w:val="25"/>
+        </w:rPr>
+        <w:t>4. Cơ chế tải dữ liệu mạng bất đồng bộ (OkHttpClient) và Thread UI</w:t>
+      </w:r>
+    </w:p>
+    <w:p>
+      <w:r>
+        <w:rPr>
+          <w:color w:val="1E293B"/>
+        </w:rPr>
+        <w:t xml:space="preserve">Hệ điều hành Android cấm tuyệt đối việc tải mạng trên luồng giao diện chính (Main UI Thread). Nếu vi phạm, app sẽ bị văng lỗi NetworkOnMainThreadException. Vì vậy, ứng dụng sử dụng thư viện </w:t>
+      </w:r>
+      <w:r>
+        <w:rPr>
+          <w:b/>
+        </w:rPr>
+        <w:t>OkHttpClient</w:t>
+      </w:r>
+      <w:r>
+        <w:rPr>
+          <w:color w:val="1E293B"/>
+        </w:rPr>
+        <w:t xml:space="preserve"> chạy ngầm ở luồng phụ (Worker Thread), sau đó dùng lệnh </w:t>
+      </w:r>
+      <w:r>
+        <w:rPr>
+          <w:b/>
+        </w:rPr>
+        <w:t>runOnUiThread()</w:t>
+      </w:r>
+      <w:r>
+        <w:t xml:space="preserve"> để đưa kết quả JSON về vẽ lên màn hình điện thoại một cách an toàn và mượt mà:</w:t>
+      </w:r>
     </w:p>
     <w:tbl>
       <w:tblPr>
@@ -409,22 +479,22 @@
         <w:tblLook w:firstColumn="1" w:firstRow="1" w:lastColumn="0" w:lastRow="0" w:noHBand="0" w:noVBand="1" w:val="04A0"/>
       </w:tblPr>
       <w:tblGrid>
-        <w:gridCol w:w="9648"/>
+        <w:gridCol w:w="9792"/>
       </w:tblGrid>
       <w:tr>
         <w:tc>
           <w:tcPr>
-            <w:tcW w:type="dxa" w:w="9648"/>
-            <w:shd w:fill="F1F5F9"/>
+            <w:tcW w:type="dxa" w:w="9792"/>
+            <w:shd w:fill="F8FAFC"/>
             <w:tcMar>
-              <w:top w:w="120" w:type="dxa"/>
-              <w:bottom w:w="120" w:type="dxa"/>
-              <w:left w:w="180" w:type="dxa"/>
-              <w:right w:w="180" w:type="dxa"/>
+              <w:top w:w="100" w:type="dxa"/>
+              <w:bottom w:w="100" w:type="dxa"/>
+              <w:left w:w="150" w:type="dxa"/>
+              <w:right w:w="150" w:type="dxa"/>
             </w:tcMar>
             <w:tcBorders>
               <w:top w:val="single" w:sz="4" w:space="0" w:color="CBD5E1"/>
-              <w:left w:val="single" w:sz="24" w:space="0" w:color="3B82F6"/>
+              <w:left w:val="single" w:sz="24" w:space="0" w:color="2563EB"/>
               <w:bottom w:val="single" w:sz="4" w:space="0" w:color="CBD5E1"/>
               <w:right w:val="single" w:sz="4" w:space="0" w:color="CBD5E1"/>
             </w:tcBorders>
@@ -439,18 +509,29 @@
                 <w:color w:val="0F172A"/>
                 <w:sz w:val="19"/>
               </w:rPr>
-              <w:t>// Lưu cấu hình vào SharedPreferences:</w:t>
+              <w:t>OkHttpClient client = new OkHttpClient();</w:t>
               <w:br/>
-              <w:t>SharedPreferences prefs = getSharedPreferences("WeatherSettings", MODE_PRIVATE);</w:t>
+              <w:t>Request request = new Request.Builder().url(apiUrl).build();</w:t>
               <w:br/>
-              <w:t>prefs.edit().putBoolean("dark_mode", true).putString("temp_unit", "C").apply();</w:t>
+              <w:t>client.newCall(request).enqueue(new Callback() {</w:t>
               <w:br/>
+              <w:t xml:space="preserve">    @Override</w:t>
               <w:br/>
-              <w:t>// Đọc cấu hình ở bất kỳ màn hình nào:</w:t>
+              <w:t xml:space="preserve">    public void onResponse(Call call, Response response) throws IOException {</w:t>
               <w:br/>
-              <w:t>boolean isDark = prefs.getBoolean("dark_mode", false);</w:t>
+              <w:t xml:space="preserve">        String jsonString = response.body().string();</w:t>
               <w:br/>
-              <w:t>String unit = prefs.getString("temp_unit", "C");</w:t>
+              <w:t xml:space="preserve">        // Trả kết quả về Main Thread để vẽ lên giao diện:</w:t>
+              <w:br/>
+              <w:t xml:space="preserve">        runOnUiThread(() -&gt; parseAndDisplayWeather(jsonString));</w:t>
+              <w:br/>
+              <w:t xml:space="preserve">    }</w:t>
+              <w:br/>
+              <w:t xml:space="preserve">    @Override</w:t>
+              <w:br/>
+              <w:t xml:space="preserve">    public void onFailure(Call call, IOException e) { ... }</w:t>
+              <w:br/>
+              <w:t>});</w:t>
             </w:r>
           </w:p>
         </w:tc>
@@ -458,161 +539,22 @@
     </w:tbl>
     <w:p>
       <w:pPr>
-        <w:spacing w:before="40" w:after="40"/>
+        <w:spacing w:before="40" w:after="80"/>
       </w:pPr>
-    </w:p>
-    <w:p>
-      <w:r>
-        <w:rPr>
-          <w:b/>
-        </w:rPr>
-        <w:t>c) Cơ chế Kế thừa Khung xương chung (BaseActivity.java):</w:t>
-        <w:br/>
-      </w:r>
-      <w:r>
-        <w:t>Tất cả 18 Activity trong dự án đều kế thừa từ lớp cha BaseActivity (public class MainActivity extends BaseActivity). Lớp cha này tự động kiểm tra cài đặt Dark Mode và Ngôn ngữ mỗi khi một màn hình được mở ra, giúp toàn bộ ứng dụng có giao diện đồng bộ 100% mà không bị lệch màu hay lẫn lộn ngôn ngữ.</w:t>
-      </w:r>
     </w:p>
     <w:p>
       <w:pPr>
         <w:pStyle w:val="Heading2"/>
         <w:keepNext/>
-        <w:spacing w:before="240" w:after="120"/>
+        <w:spacing w:before="280" w:after="120"/>
       </w:pPr>
       <w:r>
         <w:rPr>
           <w:b/>
-          <w:color w:val="2A52BE"/>
-          <w:sz w:val="26"/>
+          <w:color w:val="2563EB"/>
+          <w:sz w:val="25"/>
         </w:rPr>
-        <w:t>3. Dữ liệu thời tiết lấy ở đâu? Nguồn có uy tín không?</w:t>
-      </w:r>
-    </w:p>
-    <w:p>
-      <w:r>
-        <w:rPr>
-          <w:color w:val="1E293B"/>
-        </w:rPr>
-        <w:t xml:space="preserve">Dữ liệu thời tiết trong ứng dụng được lấy trực tuyến thời gian thực từ nền tảng máy chủ </w:t>
-      </w:r>
-      <w:r>
-        <w:rPr>
-          <w:b/>
-        </w:rPr>
-        <w:t>WeatherAPI.com (Hoa Kỳ)</w:t>
-      </w:r>
-      <w:r>
-        <w:t xml:space="preserve"> thông qua giao thức mạng HTTPS RESTful API.</w:t>
-      </w:r>
-    </w:p>
-    <w:p>
-      <w:r>
-        <w:rPr>
-          <w:b/>
-        </w:rPr>
-        <w:t xml:space="preserve"> • Độ uy tín: </w:t>
-      </w:r>
-      <w:r>
-        <w:t>WeatherAPI là một trong những cơ quan cung cấp dữ liệu khí tượng uy tín hàng đầu thế giới, lấy dữ liệu gốc từ Tổ chức Khí tượng Thế giới (WMO), Cơ quan Quản lý Khí quyển và Đại dương Quốc gia Hoa Kỳ (NOAA), Trung tâm Dự báo Thời tiết Hạn vừa Châu Âu (ECMWF) và mạng lưới hơn 50.000 trạm khí tượng mặt đất toàn cầu.</w:t>
-        <w:br/>
-      </w:r>
-      <w:r>
-        <w:rPr>
-          <w:b/>
-        </w:rPr>
-        <w:t xml:space="preserve"> • Chu kỳ cập nhật: </w:t>
-      </w:r>
-      <w:r>
-        <w:t>Dữ liệu được làm mới 15 phút một lần, đảm bảo phản ánh chính xác nhất diễn biến thời tiết.</w:t>
-        <w:br/>
-      </w:r>
-      <w:r>
-        <w:rPr>
-          <w:b/>
-        </w:rPr>
-        <w:t xml:space="preserve"> • Định dạng dữ liệu: </w:t>
-      </w:r>
-      <w:r>
-        <w:t>Máy chủ trả về chuỗi JSON chứa hàng trăm thông số chi tiết (Nhiệt độ hiện tại, Cảm giác như, Độ ẩm, Khí áp, Tầm nhìn, Tia cực tím UV, Chỉ số chất lượng không khí AQI, Bụi mịn PM2.5, PM10, Khí CO, NO2, O3, Chu kỳ mặt trời/mặt trăng).</w:t>
-      </w:r>
-    </w:p>
-    <w:p>
-      <w:pPr>
-        <w:pStyle w:val="Heading2"/>
-        <w:keepNext/>
-        <w:spacing w:before="240" w:after="120"/>
-      </w:pPr>
-      <w:r>
-        <w:rPr>
-          <w:b/>
-          <w:color w:val="2A52BE"/>
-          <w:sz w:val="26"/>
-        </w:rPr>
-        <w:t>4. Dữ liệu lưu vào đâu? Lưu tạm thời hay vĩnh viễn?</w:t>
-      </w:r>
-    </w:p>
-    <w:p>
-      <w:r>
-        <w:t>Hệ thống áp dụng mô hình phân tách lưu trữ 3 tầng chuyên nghiệp:</w:t>
-      </w:r>
-    </w:p>
-    <w:p>
-      <w:r>
-        <w:rPr>
-          <w:b/>
-        </w:rPr>
-        <w:t>1. Tầng Lưu Trữ Vĩnh Viễn (SQLite Database - File: weather_app.db):</w:t>
-        <w:br/>
-      </w:r>
-      <w:r>
-        <w:t>Do lớp DatabaseHelper.java quản lý. Gồm 2 bảng chính:</w:t>
-        <w:br/>
-      </w:r>
-      <w:r>
-        <w:t xml:space="preserve">  - Bảng users: Lưu danh sách tài khoản (id, username, email, password, role). Dữ liệu này tồn tại vĩnh viễn trên điện thoại cho đến khi người dùng xóa app hoặc Admin nhấn nút xóa tài khoản.</w:t>
-        <w:br/>
-      </w:r>
-      <w:r>
-        <w:t xml:space="preserve">  - Bảng search_history: Lưu danh sách các địa phương người dùng đã từng tìm kiếm để tra cứu nhanh cho những lần sau.</w:t>
-        <w:br/>
-        <w:br/>
-      </w:r>
-      <w:r>
-        <w:rPr>
-          <w:b/>
-        </w:rPr>
-        <w:t>2. Tầng Lưu Trữ Cấu Hình &amp; Phiên (Android SharedPreferences):</w:t>
-        <w:br/>
-      </w:r>
-      <w:r>
-        <w:t>Lưu trữ trạng thái đăng nhập (đang là ai, quyền gì), tùy chọn giao diện (Dark/Light Mode), đơn vị đo (°C/°F), ngôn ngữ hiển thị (VI/EN). Tồn tại xuyên suốt các lần tắt/mở app.</w:t>
-        <w:br/>
-        <w:br/>
-      </w:r>
-      <w:r>
-        <w:rPr>
-          <w:b/>
-        </w:rPr>
-        <w:t>3. Tầng Lưu Trữ Tạm Thời (RAM / In-Memory Cache):</w:t>
-        <w:br/>
-      </w:r>
-      <w:r>
-        <w:t>Các chuỗi JSON thời tiết tải từ mạng về được giữ tạm trong bộ nhớ RAM trong suốt vòng đời của Activity để vẽ biểu đồ và hiển thị tức thì. Khi người dùng bấm nút làm mới hoặc đóng hẳn ứng dụng, dữ liệu tạm này sẽ được giải phóng để tiết kiệm pin và RAM.</w:t>
-      </w:r>
-    </w:p>
-    <w:p>
-      <w:pPr>
-        <w:pStyle w:val="Heading2"/>
-        <w:keepNext/>
-        <w:spacing w:before="240" w:after="120"/>
-      </w:pPr>
-      <w:r>
-        <w:rPr>
-          <w:b/>
-          <w:color w:val="2A52BE"/>
-          <w:sz w:val="26"/>
-        </w:rPr>
-        <w:t>5. Định vị GPS hoạt động kiểu gì? Làm sao đảm bảo đúng, không bị lỗi tên thôn xóm lạ?</w:t>
+        <w:t>5. Định vị GPS hoạt động kiểu gì? Giải thích cặn kẽ nguyên nhân và cách đã sửa dứt điểm lỗi 'Xóm Trong / Đình Thôn'</w:t>
       </w:r>
     </w:p>
     <w:p>
@@ -623,32 +565,129 @@
         <w:t xml:space="preserve"> • Cơ chế định vị: </w:t>
       </w:r>
       <w:r>
-        <w:t>Ứng dụng sử dụng bộ điều khiển FusedLocationProviderClient (nằm trong file LocationHelper.java). Khi người dùng bấm nút 'Lấy vị trí hiện tại', thiết bị sẽ thu sóng vệ tinh GPS kết hợp với sóng trạm phát di động (Cell-ID) và Wi-Fi để xác định tọa độ Kinh độ (Longitude) và Vĩ độ (Latitude) chính xác tới từng mét.</w:t>
+        <w:t>Ứng dụng sử dụng FusedLocationProviderClient của Google Play Services trong LocationHelper.java để kết hợp tín hiệu vệ tinh GPS, sóng trạm phát di động và Wi-Fi chốt tọa độ Kinh độ (Longitude) và Vĩ độ (Latitude) chính xác tới từng mét.</w:t>
+        <w:br/>
         <w:br/>
       </w:r>
       <w:r>
         <w:rPr>
           <w:b/>
         </w:rPr>
-        <w:t xml:space="preserve"> • Cơ chế chuẩn hóa chống lỗi tên thôn xóm lạ (Đình Thôn / Xóm Trong): </w:t>
+        <w:t xml:space="preserve"> • Nguyên nhân lỗi 'Xóm Trong / Đình Thôn' trước đây: </w:t>
       </w:r>
       <w:r>
-        <w:t>Một số máy chủ thời tiết khi nhận tọa độ GPS thường tự động gắn tên vào trạm vi khí hậu đo lường nhỏ nhất đặt ở làng/xóm đó (như Xóm Trong, Đình Thôn). Ứng dụng đã xử lý triệt để vấn đề này bằng bộ lọc 2 tầng trong WeatherUtils.java và VietnamLocations.java: Tự động kiểm tra phạm vi ranh giới hành chính của 63 tỉnh thành Việt Nam; mọi tọa độ nằm trong ranh giới Hà Nội đều được chuẩn hóa hiển thị đồng nhất là 'Hà Nội' (tiếng Anh là 'Hanoi'), loại bỏ hoàn toàn các tên thôn xóm gây hiểu lầm.</w:t>
+        <w:t>Trong phiên bản cũ, tại màn hình SunMoonActivity dòng 138 có một đoạn code kiểm tra: (!displayName.isEmpty() &amp;&amp; !displayName.equals("Hà Nội")). Đoạn code này vô tình LOẠI BỎ tên 'Hà Nội' chuẩn, khiến ứng dụng buộc phải lấy tên trạm vi khí hậu nhỏ nhất ở cấp thôn xóm (như Xóm Trong hoặc Đình Thôn) do máy chủ định vị trả về.</w:t>
+        <w:br/>
+        <w:br/>
+      </w:r>
+      <w:r>
+        <w:rPr>
+          <w:b/>
+        </w:rPr>
+        <w:t xml:space="preserve"> • Cách đã sửa dứt điểm 100% trong mã nguồn v2.3: </w:t>
+      </w:r>
+      <w:r>
+        <w:t>Nhóm đã gỡ bỏ hoàn toàn điều kiện loại trừ sai lầm đó, đồng thời xây dựng bộ lọc chuẩn hóa địa danh trong WeatherUtils.java và VietnamLocations.java. Mọi tọa độ nằm trong ranh giới Hà Nội đều được chuẩn hóa hiển thị đồng nhất là 'Hà Nội' (Hanoi). Lỗi này đã được giải quyết dứt điểm hoàn toàn.</w:t>
+      </w:r>
+    </w:p>
+    <w:p>
+      <w:pPr>
+        <w:pStyle w:val="Heading2"/>
+        <w:keepNext/>
+        <w:spacing w:before="280" w:after="120"/>
+      </w:pPr>
+      <w:r>
+        <w:rPr>
+          <w:b/>
+          <w:color w:val="2563EB"/>
+          <w:sz w:val="25"/>
+        </w:rPr>
+        <w:t>6. Giải thích cách sửa dứt điểm lỗi 'Nền trắng chữ cũng trắng' (Đồng bộ Dark/Light Mode)</w:t>
+      </w:r>
+    </w:p>
+    <w:p>
+      <w:r>
+        <w:rPr>
+          <w:b/>
+        </w:rPr>
+        <w:t xml:space="preserve"> • Nguyên nhân lỗi trước đây: </w:t>
+      </w:r>
+      <w:r>
+        <w:t>Khi người dùng chuyển sang nền sáng, một số TextView sử dụng mã màu tĩnh (@android:color/white) dẫn đến việc chữ trắng nằm trên nền trắng, gây mất thị giác.</w:t>
+        <w:br/>
+      </w:r>
+      <w:r>
+        <w:rPr>
+          <w:b/>
+        </w:rPr>
+        <w:t xml:space="preserve"> • Cách đã sửa dứt điểm 100% trong mã nguồn v2.3: </w:t>
+      </w:r>
+      <w:r>
+        <w:t>Nhóm đã chuẩn hóa hệ thống bảng màu tương phản động (Dynamic Contrast Colors) trong res/values/colors.xml và res/values-night/colors.xml. Khi ở chế độ Sáng, màu chữ (@color/searchBoxText) tự động nhận mã màu đen đậm (#0F172A); khi ở chế độ Tối (Dark Mode), màu chữ tự động đổi sang màu trắng sáng (#FFFFFF). Nhờ vậy toàn bộ 18 màn hình và thanh tìm kiếm hiển thị cực kỳ rõ ràng, tương phản sắc nét.</w:t>
+      </w:r>
+    </w:p>
+    <w:p>
+      <w:pPr>
+        <w:pStyle w:val="Heading2"/>
+        <w:keepNext/>
+        <w:spacing w:before="280" w:after="120"/>
+      </w:pPr>
+      <w:r>
+        <w:rPr>
+          <w:b/>
+          <w:color w:val="2563EB"/>
+          <w:sz w:val="25"/>
+        </w:rPr>
+        <w:t>7. Mô hình lưu trữ dữ liệu 3 tầng chuyên nghiệp</w:t>
+      </w:r>
+    </w:p>
+    <w:p>
+      <w:r>
+        <w:rPr>
+          <w:b/>
+        </w:rPr>
+        <w:t>1. Tầng Vĩnh Viễn (SQLite Database - File: weather_app.db):</w:t>
+        <w:br/>
+      </w:r>
+      <w:r>
+        <w:t>Do DatabaseHelper.java quản lý. Lưu bảng users (tài khoản người dùng) và bảng search_history (lịch sử tra cứu địa danh). Tồn tại vĩnh viễn trên máy cho đến khi người dùng chủ động xóa app.</w:t>
+        <w:br/>
+      </w:r>
+      <w:r>
+        <w:rPr>
+          <w:b/>
+        </w:rPr>
+        <w:t>2. Tầng Cấu Hình (Android SharedPreferences):</w:t>
+        <w:br/>
+      </w:r>
+      <w:r>
+        <w:t>Lưu Dark Mode (dark_mode), Đơn vị nhiệt độ (temp_unit = C hoặc F), Ngôn ngữ (app_language = vi hoặc en), Trạng thái đăng nhập (isLoggedIn). Tồn tại xuyên suốt các lần mở app.</w:t>
+        <w:br/>
+      </w:r>
+      <w:r>
+        <w:rPr>
+          <w:b/>
+        </w:rPr>
+        <w:t>3. Tầng Tạm Thời (RAM / In-Memory Cache):</w:t>
+        <w:br/>
+      </w:r>
+      <w:r>
+        <w:t>Các chuỗi JSON thời tiết tải từ mạng về được lưu trên RAM trong suốt vòng đời của Activity để vẽ giao diện tức thì. Khi tắt app hoặc làm mới dữ liệu, bộ nhớ tạm này được giải phóng để tiết kiệm pin.</w:t>
       </w:r>
     </w:p>
     <w:p>
       <w:pPr>
         <w:pStyle w:val="Heading1"/>
         <w:keepNext/>
-        <w:spacing w:before="240" w:after="120"/>
+        <w:spacing w:before="280" w:after="120"/>
       </w:pPr>
       <w:r>
         <w:rPr>
           <w:b/>
           <w:color w:val="1B365D"/>
-          <w:sz w:val="32"/>
+          <w:sz w:val="30"/>
         </w:rPr>
-        <w:t>PHẦN II: BẢNG TỔNG HỢP PHÂN CÔNG 18 MÀN HÌNH CHO 5 THÀNH VIÊN</w:t>
+        <w:t>CHƯƠNG II: BẢNG TỔNG HỢP PHÂN CÔNG 18 MÀN HÌNH CHO 5 THÀNH VIÊN</w:t>
       </w:r>
     </w:p>
     <w:p>
@@ -687,12 +726,12 @@
         <w:tblLook w:firstColumn="1" w:firstRow="1" w:lastColumn="0" w:lastRow="0" w:noHBand="0" w:noVBand="1" w:val="04A0"/>
       </w:tblPr>
       <w:tblGrid>
-        <w:gridCol w:w="1608"/>
-        <w:gridCol w:w="1608"/>
-        <w:gridCol w:w="1608"/>
-        <w:gridCol w:w="1608"/>
-        <w:gridCol w:w="1608"/>
-        <w:gridCol w:w="1608"/>
+        <w:gridCol w:w="1632"/>
+        <w:gridCol w:w="1632"/>
+        <w:gridCol w:w="1632"/>
+        <w:gridCol w:w="1632"/>
+        <w:gridCol w:w="1632"/>
+        <w:gridCol w:w="1632"/>
       </w:tblGrid>
       <w:tr>
         <w:tc>
@@ -1682,30 +1721,30 @@
       <w:pPr>
         <w:pStyle w:val="Heading1"/>
         <w:keepNext/>
-        <w:spacing w:before="240" w:after="120"/>
+        <w:spacing w:before="280" w:after="120"/>
       </w:pPr>
       <w:r>
         <w:rPr>
           <w:b/>
           <w:color w:val="1B365D"/>
-          <w:sz w:val="32"/>
+          <w:sz w:val="30"/>
         </w:rPr>
-        <w:t>PHẦN III: CHI TIẾT NHIỆM VỤ &amp; HƯỚNG DẪN THUYẾT TRÌNH TỪNG BẠN</w:t>
+        <w:t>CHƯƠNG III: CHI TIẾT TỪNG MÀN HÌNH, PHÂN TÍCH CODE &amp; HƯỚNG DẪN THUYẾT TRÌNH</w:t>
       </w:r>
     </w:p>
     <w:p>
       <w:pPr>
         <w:pStyle w:val="Heading2"/>
         <w:keepNext/>
-        <w:spacing w:before="240" w:after="120"/>
+        <w:spacing w:before="280" w:after="120"/>
       </w:pPr>
       <w:r>
         <w:rPr>
           <w:b/>
-          <w:color w:val="2A52BE"/>
-          <w:sz w:val="26"/>
+          <w:color w:val="2563EB"/>
+          <w:sz w:val="25"/>
         </w:rPr>
-        <w:t>1. Thành Viên 1: BẠN CHI — Phụ Trách Mảng Xác Thực &amp; Quản Trị Hệ Thống</w:t>
+        <w:t>1. Thành Viên 1: BẠN CHI — Phụ Trách Mảng Xác Thực &amp; Quản Trị Hệ Thống (4 Màn Hình)</w:t>
       </w:r>
     </w:p>
     <w:p>
@@ -1713,10 +1752,10 @@
         <w:rPr>
           <w:b/>
         </w:rPr>
-        <w:t xml:space="preserve">Vai trò chính: </w:t>
+        <w:t xml:space="preserve">Mảng chuyên môn: </w:t>
       </w:r>
       <w:r>
-        <w:t>Xây dựng toàn bộ hệ thống quản lý tài khoản, cơ chế xác thực thông tin đăng nhập, bảo mật mật khẩu và phân quyền quản trị giữa Admin và Người dùng bình thường.</w:t>
+        <w:t>Xây dựng toàn bộ hệ thống quản trị danh tính người dùng, cơ chế xác thực thông tin đăng nhập, bảo mật mật khẩu và phân quyền quản trị giữa Admin và Người dùng bình thường.</w:t>
       </w:r>
     </w:p>
     <w:p>
@@ -1724,47 +1763,60 @@
         <w:rPr>
           <w:b/>
         </w:rPr>
-        <w:t>Chi tiết 4 màn hình đảm nhiệm:</w:t>
+        <w:t>Phân tích chi tiết 4 màn hình đảm nhiệm:</w:t>
         <w:br/>
       </w:r>
       <w:r>
         <w:rPr>
           <w:b/>
         </w:rPr>
-        <w:t xml:space="preserve"> 1. LoginActivity (Màn hình Đăng Nhập): </w:t>
+        <w:t xml:space="preserve"> • Màn 1: LoginActivity (Màn hình Đăng Nhập — activity_login.xml):</w:t>
+        <w:br/>
       </w:r>
       <w:r>
-        <w:t>Cho phép người dùng điền Username và Password để đăng nhập; tích hợp hộp kiểm 'Ghi nhớ đăng nhập' (Remember Me) lưu trạng thái vào SharedPreferences; có nút 'Bỏ qua đăng nhập' (Chế độ Khách) để vào xem thời tiết ngay; có liên kết chuyển nhanh sang trang Đăng Ký.</w:t>
+        <w:t xml:space="preserve">   - Chức năng: Cho phép người dùng nhập Tên đăng nhập và Mật khẩu. Hỗ trợ checkbox 'Ghi nhớ mật khẩu' lưu vào SharedPreferences. Nút 'Bỏ qua đăng nhập' (Chế độ Khách) giúp người dùng vào xem thời tiết ngay trong tình huống gấp. Liên kết chuyển nhanh sang trang Đăng Ký.</w:t>
+        <w:br/>
+      </w:r>
+      <w:r>
+        <w:t xml:space="preserve">   - Dữ liệu: Truy vấn SQLite bảng users để xác thực thông tin. Đã dịch song ngữ Tiếng Việt / Tiếng Anh chuẩn 100% trong bản mới v2.3.</w:t>
         <w:br/>
       </w:r>
       <w:r>
         <w:rPr>
           <w:b/>
         </w:rPr>
-        <w:t xml:space="preserve"> 2. RegisterActivity (Màn hình Đăng Ký): </w:t>
+        <w:t xml:space="preserve"> • Màn 2: RegisterActivity (Màn hình Đăng Ký — activity_register.xml):</w:t>
+        <w:br/>
       </w:r>
       <w:r>
-        <w:t>Form tạo tài khoản mới gồm Tên đăng nhập, Email, Mật khẩu và Xác nhận mật khẩu. Code kiểm tra tính hợp lệ (Validation): mật khẩu phải từ 6 ký tự trở lên, mật khẩu nhập lại phải khớp 100%, tên đăng nhập chưa từng tồn tại trong Database. Quyền mặc định gán cho người dùng mới là 'user'.</w:t>
+        <w:t xml:space="preserve">   - Chức năng: Form tạo tài khoản gồm Username, Email, Mật khẩu và Xác nhận lại mật khẩu. Kiểm tra tính hợp lệ: mật khẩu &gt;= 6 ký tự, mật khẩu nhập lại phải khớp, tên đăng nhập chưa từng tồn tại trong Database. Quyền mặc định khi đăng ký là 'user'.</w:t>
+        <w:br/>
+      </w:r>
+      <w:r>
+        <w:t xml:space="preserve">   - Dữ liệu: Thực thi lệnh INSERT vào bảng users trong SQLite.</w:t>
         <w:br/>
       </w:r>
       <w:r>
         <w:rPr>
           <w:b/>
         </w:rPr>
-        <w:t xml:space="preserve"> 3. UserProfileActivity (Màn hình Hồ Sơ Cá Nhân): </w:t>
+        <w:t xml:space="preserve"> • Màn 3: UserProfileActivity (Màn hình Hồ Sơ Cá Nhân — activity_user_profile.xml):</w:t>
+        <w:br/>
       </w:r>
       <w:r>
-        <w:t>Hiển thị ảnh đại diện, Tên tài khoản, Email, Vai trò (admin / user / Khách). Cho phép người dùng đổi mật khẩu (yêu cầu nhập đúng mật khẩu cũ trước khi đổi). Có nút 'Đăng xuất' để xóa phiên làm việc và trở về màn hình đăng nhập. Có nút 'Quản lý người dùng' (chỉ hiện ra khi tài khoản có quyền admin).</w:t>
+        <w:t xml:space="preserve">   - Chức năng: Hiển thị Avatar, Tên người dùng, Email, Vai trò (admin / user / Khách). Cho phép đổi mật khẩu cá nhân (yêu cầu xác thực mật khẩu cũ). Có nút Đăng xuất xóa phiên làm việc. Nút 'Quản trị người dùng' chỉ hiện ra khi người đăng nhập là Admin.</w:t>
         <w:br/>
       </w:r>
       <w:r>
         <w:rPr>
           <w:b/>
         </w:rPr>
-        <w:t xml:space="preserve"> 4. UserManagementActivity (Màn hình Quản Lý Người Dùng - Dành riêng cho Admin): </w:t>
+        <w:t xml:space="preserve"> • Màn 4: UserManagementActivity (Màn hình Quản Trị User Dành Cho Admin — activity_user_management.xml):</w:t>
+        <w:br/>
       </w:r>
       <w:r>
-        <w:t>Hiển thị danh sách toàn bộ người dùng trong hệ thống dưới dạng RecyclerView. Admin có thể bấm nút Xóa để loại bỏ tài khoản người dùng vi phạm. Hệ thống chặn không cho Admin tự xóa chính tài khoản của mình.</w:t>
+        <w:t xml:space="preserve">   - Chức năng: Hiển thị danh sách toàn bộ người dùng trong hệ thống dưới dạng RecyclerView qua UserAdapter.java. Admin có nút thùng rác để xóa tài khoản người dùng vi phạm. Hệ thống có cơ chế bảo vệ chặn không cho Admin tự xóa chính tài khoản admin của mình.</w:t>
+        <w:br/>
       </w:r>
     </w:p>
     <w:p>
@@ -1772,19 +1824,13 @@
         <w:rPr>
           <w:b/>
         </w:rPr>
-        <w:t>Các dòng code Java then chốt bạn Chi cần chỉ cho thầy cô xem:</w:t>
+        <w:t>Các đoạn code Java then chốt bạn Chi cần mở cho giảng viên xem:</w:t>
         <w:br/>
       </w:r>
       <w:r>
-        <w:t xml:space="preserve"> • Khởi tạo bảng users trong DatabaseHelper.java:</w:t>
+        <w:t xml:space="preserve"> • 1. Tạo bảng users trong DatabaseHelper.java:</w:t>
         <w:br/>
       </w:r>
-    </w:p>
-    <w:p>
-      <w:pPr>
-        <w:spacing w:before="80" w:after="120"/>
-        <w:ind w:left="360" w:right="360"/>
-      </w:pPr>
     </w:p>
     <w:tbl>
       <w:tblPr>
@@ -1793,22 +1839,22 @@
         <w:tblLook w:firstColumn="1" w:firstRow="1" w:lastColumn="0" w:lastRow="0" w:noHBand="0" w:noVBand="1" w:val="04A0"/>
       </w:tblPr>
       <w:tblGrid>
-        <w:gridCol w:w="9648"/>
+        <w:gridCol w:w="9792"/>
       </w:tblGrid>
       <w:tr>
         <w:tc>
           <w:tcPr>
-            <w:tcW w:type="dxa" w:w="9648"/>
-            <w:shd w:fill="F1F5F9"/>
+            <w:tcW w:type="dxa" w:w="9792"/>
+            <w:shd w:fill="F8FAFC"/>
             <w:tcMar>
-              <w:top w:w="120" w:type="dxa"/>
-              <w:bottom w:w="120" w:type="dxa"/>
-              <w:left w:w="180" w:type="dxa"/>
-              <w:right w:w="180" w:type="dxa"/>
+              <w:top w:w="100" w:type="dxa"/>
+              <w:bottom w:w="100" w:type="dxa"/>
+              <w:left w:w="150" w:type="dxa"/>
+              <w:right w:w="150" w:type="dxa"/>
             </w:tcMar>
             <w:tcBorders>
               <w:top w:val="single" w:sz="4" w:space="0" w:color="CBD5E1"/>
-              <w:left w:val="single" w:sz="24" w:space="0" w:color="3B82F6"/>
+              <w:left w:val="single" w:sz="24" w:space="0" w:color="2563EB"/>
               <w:bottom w:val="single" w:sz="4" w:space="0" w:color="CBD5E1"/>
               <w:right w:val="single" w:sz="4" w:space="0" w:color="CBD5E1"/>
             </w:tcBorders>
@@ -1843,20 +1889,14 @@
     </w:tbl>
     <w:p>
       <w:pPr>
-        <w:spacing w:before="40" w:after="40"/>
+        <w:spacing w:before="40" w:after="80"/>
       </w:pPr>
     </w:p>
     <w:p>
       <w:r>
-        <w:t xml:space="preserve"> • Kiểm tra đăng nhập trong DatabaseHelper.java:</w:t>
+        <w:t xml:space="preserve"> • 2. Xác thực đăng nhập trong LoginActivity.java:</w:t>
         <w:br/>
       </w:r>
-    </w:p>
-    <w:p>
-      <w:pPr>
-        <w:spacing w:before="80" w:after="120"/>
-        <w:ind w:left="360" w:right="360"/>
-      </w:pPr>
     </w:p>
     <w:tbl>
       <w:tblPr>
@@ -1865,22 +1905,22 @@
         <w:tblLook w:firstColumn="1" w:firstRow="1" w:lastColumn="0" w:lastRow="0" w:noHBand="0" w:noVBand="1" w:val="04A0"/>
       </w:tblPr>
       <w:tblGrid>
-        <w:gridCol w:w="9648"/>
+        <w:gridCol w:w="9792"/>
       </w:tblGrid>
       <w:tr>
         <w:tc>
           <w:tcPr>
-            <w:tcW w:type="dxa" w:w="9648"/>
-            <w:shd w:fill="F1F5F9"/>
+            <w:tcW w:type="dxa" w:w="9792"/>
+            <w:shd w:fill="F8FAFC"/>
             <w:tcMar>
-              <w:top w:w="120" w:type="dxa"/>
-              <w:bottom w:w="120" w:type="dxa"/>
-              <w:left w:w="180" w:type="dxa"/>
-              <w:right w:w="180" w:type="dxa"/>
+              <w:top w:w="100" w:type="dxa"/>
+              <w:bottom w:w="100" w:type="dxa"/>
+              <w:left w:w="150" w:type="dxa"/>
+              <w:right w:w="150" w:type="dxa"/>
             </w:tcMar>
             <w:tcBorders>
               <w:top w:val="single" w:sz="4" w:space="0" w:color="CBD5E1"/>
-              <w:left w:val="single" w:sz="24" w:space="0" w:color="3B82F6"/>
+              <w:left w:val="single" w:sz="24" w:space="0" w:color="2563EB"/>
               <w:bottom w:val="single" w:sz="4" w:space="0" w:color="CBD5E1"/>
               <w:right w:val="single" w:sz="4" w:space="0" w:color="CBD5E1"/>
             </w:tcBorders>
@@ -1895,27 +1935,27 @@
                 <w:color w:val="0F172A"/>
                 <w:sz w:val="19"/>
               </w:rPr>
-              <w:t>public User checkUser(String username, String password) {</w:t>
+              <w:t>User user = dbHelper.checkUser(username, password);</w:t>
               <w:br/>
-              <w:t xml:space="preserve">    SQLiteDatabase db = this.getReadableDatabase();</w:t>
+              <w:t>if (user != null) {</w:t>
               <w:br/>
-              <w:t xml:space="preserve">    Cursor cursor = db.rawQuery("SELECT * FROM users WHERE username = ? AND password = ?", </w:t>
+              <w:t xml:space="preserve">    SharedPreferences.Editor editor = getSharedPreferences("UserPrefs", MODE_PRIVATE).edit();</w:t>
               <w:br/>
-              <w:t xml:space="preserve">                                new String[]{username, password});</w:t>
+              <w:t xml:space="preserve">    editor.putBoolean("isLoggedIn", true);</w:t>
               <w:br/>
-              <w:t xml:space="preserve">    if (cursor != null &amp;&amp; cursor.moveToFirst()) {</w:t>
+              <w:t xml:space="preserve">    editor.putString("username", user.getUsername());</w:t>
               <w:br/>
-              <w:t xml:space="preserve">        User user = new User(cursor.getInt(0), cursor.getString(1), </w:t>
+              <w:t xml:space="preserve">    editor.putString("role", user.getRole());</w:t>
               <w:br/>
-              <w:t xml:space="preserve">                             cursor.getString(2), cursor.getString(3), cursor.getString(4));</w:t>
+              <w:t xml:space="preserve">    editor.apply();</w:t>
               <w:br/>
-              <w:t xml:space="preserve">        cursor.close();</w:t>
+              <w:t xml:space="preserve">    // Chuyển sang màn hình chính:</w:t>
               <w:br/>
-              <w:t xml:space="preserve">        return user; // Đăng nhập thành công</w:t>
+              <w:t xml:space="preserve">    Intent intent = new Intent(LoginActivity.this, MainActivity.class);</w:t>
               <w:br/>
-              <w:t xml:space="preserve">    }</w:t>
+              <w:t xml:space="preserve">    startActivity(intent);</w:t>
               <w:br/>
-              <w:t xml:space="preserve">    return null; // Sai tài khoản hoặc mật khẩu</w:t>
+              <w:t xml:space="preserve">    finish();</w:t>
               <w:br/>
               <w:t>}</w:t>
             </w:r>
@@ -1925,7 +1965,7 @@
     </w:tbl>
     <w:p>
       <w:pPr>
-        <w:spacing w:before="40" w:after="40"/>
+        <w:spacing w:before="40" w:after="80"/>
       </w:pPr>
     </w:p>
     <w:tbl>
@@ -1935,22 +1975,22 @@
         <w:tblLook w:firstColumn="1" w:firstRow="1" w:lastColumn="0" w:lastRow="0" w:noHBand="0" w:noVBand="1" w:val="04A0"/>
       </w:tblPr>
       <w:tblGrid>
-        <w:gridCol w:w="9648"/>
+        <w:gridCol w:w="9792"/>
       </w:tblGrid>
       <w:tr>
         <w:tc>
           <w:tcPr>
-            <w:tcW w:type="dxa" w:w="9648"/>
+            <w:tcW w:type="dxa" w:w="9792"/>
             <w:shd w:fill="EFF6FF"/>
             <w:tcMar>
-              <w:top w:w="140" w:type="dxa"/>
-              <w:bottom w:w="140" w:type="dxa"/>
-              <w:left w:w="200" w:type="dxa"/>
-              <w:right w:w="200" w:type="dxa"/>
+              <w:top w:w="120" w:type="dxa"/>
+              <w:bottom w:w="120" w:type="dxa"/>
+              <w:left w:w="160" w:type="dxa"/>
+              <w:right w:w="160" w:type="dxa"/>
             </w:tcMar>
             <w:tcBorders>
               <w:top w:val="none"/>
-              <w:left w:val="single" w:sz="36" w:space="0" w:color="3B82F6"/>
+              <w:left w:val="single" w:sz="32" w:space="0" w:color="2563EB"/>
               <w:bottom w:val="none"/>
               <w:right w:val="none"/>
             </w:tcBorders>
@@ -1966,7 +2006,7 @@
                 <w:color w:val="1E3A8A"/>
                 <w:sz w:val="21"/>
               </w:rPr>
-              <w:t>🎤 Câu nói mẫu giúp bạn Chi tự tin thuyết trình:</w:t>
+              <w:t>🎤 Câu nói mẫu giúp bạn Chi mở đầu thuyết trình ăn điểm tuyệt đối:</w:t>
               <w:br/>
             </w:r>
             <w:r>
@@ -1975,7 +2015,7 @@
                 <w:color w:val="1E293B"/>
                 <w:sz w:val="20"/>
               </w:rPr>
-              <w:t>"Thưa thầy cô, em phụ trách toàn bộ hệ thống quản trị danh tính người dùng và phân quyền RBAC (Role-Based Access Control). Hệ thống của em lưu trữ dữ liệu an toàn trong cơ sở dữ liệu SQLite cục bộ 'weather_app.db' thông qua lớp DatabaseHelper.java. Em đã phân cấp rành mạch giữa tài khoản Quản trị viên (Admin) và tài khoản thường (User), đồng thời cung cấp chế độ Khách (Guest Mode) giúp người dùng có thể tra cứu thời tiết tức thì trong tình huống khẩn cấp mà không bị ép buộc đăng ký."</w:t>
+              <w:t>"Thưa thầy cô, em phụ trách toàn bộ hệ thống quản trị danh tính và phân quyền RBAC (Role-Based Access Control). Hệ thống của em lưu trữ an toàn trong bảng users của SQLite cục bộ. Em đã phân cấp rõ ràng giữa tài khoản Admin (có quyền quản lý và xóa người dùng) và tài khoản User thường (chỉ được xem và đổi mật khẩu của mình), đồng thời tích hợp chế độ Khách (Guest Mode) giúp người dùng tra cứu nhanh trong tình huống gấp. Bản mới nhất đã được em chuẩn hóa song ngữ Anh - Việt 100% không còn bất kỳ lỗi nào ạ."</w:t>
             </w:r>
           </w:p>
         </w:tc>
@@ -1990,13 +2030,13 @@
       <w:pPr>
         <w:pStyle w:val="Heading2"/>
         <w:keepNext/>
-        <w:spacing w:before="240" w:after="120"/>
+        <w:spacing w:before="280" w:after="120"/>
       </w:pPr>
       <w:r>
         <w:rPr>
           <w:b/>
-          <w:color w:val="2A52BE"/>
-          <w:sz w:val="26"/>
+          <w:color w:val="2563EB"/>
+          <w:sz w:val="25"/>
         </w:rPr>
         <w:t>2. Thành Viên 2: BẠN HẰNG NGA — Phụ Trách Dữ Liệu Khí Tượng &amp; Dự Báo (4 Màn Hình)</w:t>
       </w:r>
@@ -2006,10 +2046,10 @@
         <w:rPr>
           <w:b/>
         </w:rPr>
-        <w:t xml:space="preserve">Vai trò chính: </w:t>
+        <w:t xml:space="preserve">Mảng chuyên môn: </w:t>
       </w:r>
       <w:r>
-        <w:t>Chịu trách nhiệm kết nối mạng với máy chủ WeatherAPI, bóc tách chuỗi JSON trả về và tổ chức hiển thị trực quan các mô hình dự báo thời gian (theo giờ, 3 ngày, 7 ngày).</w:t>
+        <w:t>Chịu trách nhiệm kết nối mạng với máy chủ WeatherAPI, bóc tách chuỗi JSON thời tiết và tổ chức hiển thị trực quan các mô hình dự báo thời gian (theo giờ, 3 ngày, 7 ngày).</w:t>
       </w:r>
     </w:p>
     <w:p>
@@ -2017,47 +2057,52 @@
         <w:rPr>
           <w:b/>
         </w:rPr>
-        <w:t>Chi tiết 4 màn hình đảm nhiệm (Màn 5 -&gt; Màn 8):</w:t>
+        <w:t>Phân tích chi tiết 4 màn hình đảm nhiệm:</w:t>
         <w:br/>
       </w:r>
       <w:r>
         <w:rPr>
           <w:b/>
         </w:rPr>
-        <w:t xml:space="preserve"> • Màn 5: MainActivity (Trang Chủ Thời Tiết): </w:t>
+        <w:t xml:space="preserve"> • Màn 5: MainActivity (Màn hình Trang Chủ Thời Tiết — activity_main.xml):</w:t>
+        <w:br/>
       </w:r>
       <w:r>
-        <w:t>Màn hình quan trọng nhất của app. Hiển thị nhiệt độ hiện tại, trạng thái bầu trời (nắng, mưa, nhiều mây), nhiệt độ cảm nhận thực tế, biên độ nhiệt độ Cao nhất - Thấp nhất trong ngày. Tích hợp thanh vuốt từ trên xuống để làm mới dữ liệu (SwipeRefreshLayout) và thanh điều hướng truy cập nhanh các tính năng.</w:t>
+        <w:t xml:space="preserve">   - Chức năng: Màn hình trung tâm của app. Hiển thị nhiệt độ hiện tại, trạng thái bầu trời, nhiệt độ cảm nhận, biên độ nhiệt độ Cao - Thấp trong ngày. Tích hợp thanh vuốt kéo từ trên xuống để làm mới dữ liệu (SwipeRefreshLayout) và các nút truy cập nhanh vào tất cả các tính năng khác.</w:t>
         <w:br/>
       </w:r>
       <w:r>
         <w:rPr>
           <w:b/>
         </w:rPr>
-        <w:t xml:space="preserve"> • Màn 6: HourlyForecastActivity (Dự Báo 24 Giờ Tiếp Theo): </w:t>
+        <w:t xml:space="preserve"> • Màn 6: HourlyForecastActivity (Màn hình Dự Báo 24 Giờ Tiếp Theo — activity_hourly_forecast.xml):</w:t>
+        <w:br/>
       </w:r>
       <w:r>
-        <w:t>Hiển thị bảng cuộn 24 mốc thời gian trong ngày tới. Cung cấp: Mốc giờ (VD: 14:00, 15:00), Biểu tượng thời tiết, Nhiệt độ dự báo và Khả năng có mưa (%).</w:t>
+        <w:t xml:space="preserve">   - Chức năng: Hiển thị bảng cuộn 24 mốc thời gian tiếp theo trong ngày. Cung cấp: Giờ trong ngày (VD: 14:00, 15:00), Biểu tượng thời tiết, Nhiệt độ dự báo và Khả năng có mưa (%). Dữ liệu hiển thị qua RecyclerView và item_hourly_forecast.xml.</w:t>
         <w:br/>
       </w:r>
       <w:r>
         <w:rPr>
           <w:b/>
         </w:rPr>
-        <w:t xml:space="preserve"> • Màn 7: Forecast3DaysActivity (Dự Báo 3 Ngày Tới): </w:t>
+        <w:t xml:space="preserve"> • Màn 7: Forecast3DaysActivity (Màn hình Dự Báo 3 Ngày Tới — activity_forecast_3days.xml):</w:t>
+        <w:br/>
       </w:r>
       <w:r>
-        <w:t>Mô hình dự báo ngắn hạn 3 ngày kế tiếp (Hôm nay, Ngày mai, Ngày kia) với lượng mưa tích lũy và tốc độ gió trung bình.</w:t>
+        <w:t xml:space="preserve">   - Chức năng: Mô hình dự báo ngắn hạn 3 ngày kế tiếp (Hôm nay, Ngày mai, Ngày kia) với lượng mưa tích lũy và tốc độ gió trung bình.</w:t>
         <w:br/>
       </w:r>
       <w:r>
         <w:rPr>
           <w:b/>
         </w:rPr>
-        <w:t xml:space="preserve"> • Màn 8: ForecastActivity (Dự Báo Xu Hướng 7 Ngày): </w:t>
+        <w:t xml:space="preserve"> • Màn 8: ForecastActivity (Màn hình Dự Báo Xu Hướng 7 Ngày — activity_forecast.xml):</w:t>
+        <w:br/>
       </w:r>
       <w:r>
-        <w:t>Mô hình dự báo trung hạn cả tuần phục vụ người dùng lên kế hoạch đi du lịch, công tác dài ngày.</w:t>
+        <w:t xml:space="preserve">   - Chức năng: Mô hình dự báo trung hạn cho cả tuần phục vụ người dùng lên kế hoạch đi công tác, du lịch xa ngày. Hiển thị dạng danh sách thẻ Card trực quan qua item_forecast.xml.</w:t>
+        <w:br/>
       </w:r>
     </w:p>
     <w:p>
@@ -2065,19 +2110,13 @@
         <w:rPr>
           <w:b/>
         </w:rPr>
-        <w:t>Các dòng code Java then chốt bạn Hằng Nga cần chỉ cho thầy cô xem:</w:t>
+        <w:t>Các đoạn code Java then chốt bạn Hằng Nga cần mở cho giảng viên xem:</w:t>
         <w:br/>
       </w:r>
       <w:r>
-        <w:t xml:space="preserve"> • Gửi yêu cầu mạng bất đồng bộ bằng OkHttpClient trong MainActivity.java:</w:t>
+        <w:t xml:space="preserve"> • 1. Gọi API và bóc tách JSON thời tiết trong MainActivity.java:</w:t>
         <w:br/>
       </w:r>
-    </w:p>
-    <w:p>
-      <w:pPr>
-        <w:spacing w:before="80" w:after="120"/>
-        <w:ind w:left="360" w:right="360"/>
-      </w:pPr>
     </w:p>
     <w:tbl>
       <w:tblPr>
@@ -2086,22 +2125,22 @@
         <w:tblLook w:firstColumn="1" w:firstRow="1" w:lastColumn="0" w:lastRow="0" w:noHBand="0" w:noVBand="1" w:val="04A0"/>
       </w:tblPr>
       <w:tblGrid>
-        <w:gridCol w:w="9648"/>
+        <w:gridCol w:w="9792"/>
       </w:tblGrid>
       <w:tr>
         <w:tc>
           <w:tcPr>
-            <w:tcW w:type="dxa" w:w="9648"/>
-            <w:shd w:fill="F1F5F9"/>
+            <w:tcW w:type="dxa" w:w="9792"/>
+            <w:shd w:fill="F8FAFC"/>
             <w:tcMar>
-              <w:top w:w="120" w:type="dxa"/>
-              <w:bottom w:w="120" w:type="dxa"/>
-              <w:left w:w="180" w:type="dxa"/>
-              <w:right w:w="180" w:type="dxa"/>
+              <w:top w:w="100" w:type="dxa"/>
+              <w:bottom w:w="100" w:type="dxa"/>
+              <w:left w:w="150" w:type="dxa"/>
+              <w:right w:w="150" w:type="dxa"/>
             </w:tcMar>
             <w:tcBorders>
               <w:top w:val="single" w:sz="4" w:space="0" w:color="CBD5E1"/>
-              <w:left w:val="single" w:sz="24" w:space="0" w:color="3B82F6"/>
+              <w:left w:val="single" w:sz="24" w:space="0" w:color="2563EB"/>
               <w:bottom w:val="single" w:sz="4" w:space="0" w:color="CBD5E1"/>
               <w:right w:val="single" w:sz="4" w:space="0" w:color="CBD5E1"/>
             </w:tcBorders>
@@ -2133,9 +2172,21 @@
               <w:br/>
               <w:t xml:space="preserve">        String jsonData = response.body().string();</w:t>
               <w:br/>
-              <w:t xml:space="preserve">        // Trả kết quả về Main Thread để cập nhật giao diện:</w:t>
+              <w:t xml:space="preserve">        runOnUiThread(() -&gt; {</w:t>
               <w:br/>
-              <w:t xml:space="preserve">        runOnUiThread(() -&gt; parseWeatherData(jsonData));</w:t>
+              <w:t xml:space="preserve">            JSONObject root = new JSONObject(jsonData);</w:t>
+              <w:br/>
+              <w:t xml:space="preserve">            JSONObject current = root.getJSONObject("current");</w:t>
+              <w:br/>
+              <w:t xml:space="preserve">            double tempC = current.getDouble("temp_c");</w:t>
+              <w:br/>
+              <w:t xml:space="preserve">            String condition = current.getJSONObject("condition").getString("text");</w:t>
+              <w:br/>
+              <w:t xml:space="preserve">            tempText.setText(WeatherUtils.formatTemperature(tempC, isFahrenheit));</w:t>
+              <w:br/>
+              <w:t xml:space="preserve">            conditionText.setText(condition);</w:t>
+              <w:br/>
+              <w:t xml:space="preserve">        });</w:t>
               <w:br/>
               <w:t xml:space="preserve">    }</w:t>
               <w:br/>
@@ -2147,7 +2198,7 @@
     </w:tbl>
     <w:p>
       <w:pPr>
-        <w:spacing w:before="40" w:after="40"/>
+        <w:spacing w:before="40" w:after="80"/>
       </w:pPr>
     </w:p>
     <w:tbl>
@@ -2157,22 +2208,22 @@
         <w:tblLook w:firstColumn="1" w:firstRow="1" w:lastColumn="0" w:lastRow="0" w:noHBand="0" w:noVBand="1" w:val="04A0"/>
       </w:tblPr>
       <w:tblGrid>
-        <w:gridCol w:w="9648"/>
+        <w:gridCol w:w="9792"/>
       </w:tblGrid>
       <w:tr>
         <w:tc>
           <w:tcPr>
-            <w:tcW w:type="dxa" w:w="9648"/>
+            <w:tcW w:type="dxa" w:w="9792"/>
             <w:shd w:fill="EFF6FF"/>
             <w:tcMar>
-              <w:top w:w="140" w:type="dxa"/>
-              <w:bottom w:w="140" w:type="dxa"/>
-              <w:left w:w="200" w:type="dxa"/>
-              <w:right w:w="200" w:type="dxa"/>
+              <w:top w:w="120" w:type="dxa"/>
+              <w:bottom w:w="120" w:type="dxa"/>
+              <w:left w:w="160" w:type="dxa"/>
+              <w:right w:w="160" w:type="dxa"/>
             </w:tcMar>
             <w:tcBorders>
               <w:top w:val="none"/>
-              <w:left w:val="single" w:sz="36" w:space="0" w:color="3B82F6"/>
+              <w:left w:val="single" w:sz="32" w:space="0" w:color="2563EB"/>
               <w:bottom w:val="none"/>
               <w:right w:val="none"/>
             </w:tcBorders>
@@ -2188,7 +2239,7 @@
                 <w:color w:val="1E3A8A"/>
                 <w:sz w:val="21"/>
               </w:rPr>
-              <w:t>🎤 Câu nói mẫu giúp bạn Hằng Nga tự tin thuyết trình:</w:t>
+              <w:t>🎤 Câu nói mẫu giúp bạn Hằng Nga mở đầu thuyết trình ăn điểm tuyệt đối:</w:t>
               <w:br/>
             </w:r>
             <w:r>
@@ -2197,7 +2248,7 @@
                 <w:color w:val="1E293B"/>
                 <w:sz w:val="20"/>
               </w:rPr>
-              <w:t>"Thưa thầy cô, em đảm nhiệm mảng kết nối và xử lý dữ liệu khí tượng trực tuyến từ dịch vụ thời tiết quốc tế WeatherAPI. Em sử dụng thư viện OkHttpClient để gọi API bất đồng bộ (Asynchronous Network Call) giúp giao diện ứng dụng luôn mượt mà. Toàn bộ dữ liệu JSON trả về được em bóc tách và đổ vào các danh sách RecyclerView để người dùng dễ dàng theo dõi dự báo chi tiết theo từng giờ, 3 ngày và 7 ngày."</w:t>
+              <w:t>"Thưa thầy cô, em đảm nhiệm mảng kết nối và xử lý dữ liệu khí tượng trực tuyến từ máy chủ WeatherAPI. Em sử dụng thư viện OkHttpClient để gọi API bất đồng bộ giúp giao diện ứng dụng luôn mượt mà. Dữ liệu JSON trả về được em bóc tách và đổ vào các danh sách RecyclerView để người dùng dễ dàng theo dõi dự báo chi tiết theo từng giờ, 3 ngày và 7 ngày với độ chính xác cao nhất ạ."</w:t>
             </w:r>
           </w:p>
         </w:tc>
@@ -2212,13 +2263,13 @@
       <w:pPr>
         <w:pStyle w:val="Heading2"/>
         <w:keepNext/>
-        <w:spacing w:before="240" w:after="120"/>
+        <w:spacing w:before="280" w:after="120"/>
       </w:pPr>
       <w:r>
         <w:rPr>
           <w:b/>
-          <w:color w:val="2A52BE"/>
-          <w:sz w:val="26"/>
+          <w:color w:val="2563EB"/>
+          <w:sz w:val="25"/>
         </w:rPr>
         <w:t>3. Thành Viên 3: BẠN THÙY TRANG — Phụ Trách Định Vị GPS, Tra Cứu &amp; Thiên Văn Tọa Độ (3 Màn Hình)</w:t>
       </w:r>
@@ -2228,7 +2279,7 @@
         <w:rPr>
           <w:b/>
         </w:rPr>
-        <w:t xml:space="preserve">Vai trò chính: </w:t>
+        <w:t xml:space="preserve">Mảng chuyên môn: </w:t>
       </w:r>
       <w:r>
         <w:t>Xây dựng mô-đun định vị phần cứng GPS, thuật toán chuẩn hóa địa danh chống lỗi trạm vi khí hậu, hệ thống tra cứu thông minh 63 tỉnh thành Việt Nam và tính toán thiên văn học mặt trời mặt trăng theo tọa độ địa lý.</w:t>
@@ -2239,37 +2290,45 @@
         <w:rPr>
           <w:b/>
         </w:rPr>
-        <w:t>Chi tiết 3 màn hình đảm nhiệm (Màn 9 -&gt; Màn 11):</w:t>
+        <w:t>Phân tích chi tiết 3 màn hình đảm nhiệm:</w:t>
         <w:br/>
       </w:r>
       <w:r>
         <w:rPr>
           <w:b/>
         </w:rPr>
-        <w:t xml:space="preserve"> • Màn 9: CurrentLocationActivity (Định Vị Radar GPS Vệ Tinh): </w:t>
+        <w:t xml:space="preserve"> • Màn 9: CurrentLocationActivity (Định Vị Radar GPS Vệ Tinh — activity_current_location.xml):</w:t>
+        <w:br/>
       </w:r>
       <w:r>
-        <w:t>Tự động kết nối phần cứng GPS của điện thoại để lấy tọa độ Vĩ độ và Kinh độ thời gian thực. Hiển thị la bàn tọa độ, độ chính xác vệ tinh (Accuracy tính bằng mét), thời gian chốt vị trí gần nhất. Áp dụng thuật toán Reverse Geocoding chuẩn hóa để hiển thị đúng tên Thành phố trung tâm.</w:t>
+        <w:t xml:space="preserve">   - Chức năng: Tự động kết nối phần cứng GPS của điện thoại để lấy tọa độ Vĩ độ (Latitude) và Kinh độ (Longitude) thời gian thực. Hiển thị la bàn tọa độ, độ chính xác của vệ tinh tính bằng mét, thời gian chốt vị trí. Áp dụng thuật toán Reverse Geocoding chuẩn hóa địa danh.</w:t>
         <w:br/>
       </w:r>
       <w:r>
         <w:rPr>
           <w:b/>
         </w:rPr>
-        <w:t xml:space="preserve"> • Màn 10: SearchLocationActivity (Tra Cứu 63 Tỉnh Thành Toàn Quốc): </w:t>
+        <w:t xml:space="preserve"> • Màn 10: SearchLocationActivity (Tra Cứu 63 Tỉnh Thành Toàn Quốc — activity_search_location.xml):</w:t>
+        <w:br/>
       </w:r>
       <w:r>
-        <w:t>Thanh tìm kiếm thông minh gợi ý danh sách địa phương ngay khi gõ phím. Hỗ trợ tìm kiếm tiếng Việt toàn diện (gõ không dấu như 'da nang' hay có dấu như 'Đà Nẵng' đều ra chuẩn 100%). Quản lý lịch sử tra cứu gần đây (lưu trong bảng SQLite search_history).</w:t>
+        <w:t xml:space="preserve">   - Chức năng: Thanh tìm kiếm thông minh gợi ý địa danh ngay khi người dùng gõ phím. Hỗ trợ tìm kiếm tiếng Việt toàn diện (gõ không dấu như 'da nang' hay có dấu như 'Đà Nẵng' đều ra chuẩn 100%). Cung cấp các nút bấm chọn nhanh đô thị lớn. Quản lý lịch sử tra cứu gần đây (lưu trong bảng SQLite search_history, hỗ trợ xóa từng mục hoặc xóa sạch).</w:t>
         <w:br/>
       </w:r>
       <w:r>
         <w:rPr>
           <w:b/>
         </w:rPr>
-        <w:t xml:space="preserve"> • Màn 11: SunMoonActivity (Thiên Văn Học Mặt Trời &amp; Mặt Trăng): </w:t>
+        <w:t xml:space="preserve"> • Màn 11: SunMoonActivity (Thiên Văn Học Mặt Trời &amp; Mặt Trăng — activity_sun_moon.xml):</w:t>
+        <w:br/>
       </w:r>
       <w:r>
-        <w:t>Dựa trên tọa độ kinh vĩ độ của địa phương đã chốt vị trí, hệ thống tính toán chính xác giờ Mặt trời mọc (Sunrise), Mặt trời lặn (Sunset), Mặt trăng mọc (Moonrise), Mặt trăng lặn (Moonset), Tuần trăng (Moon Phase) và Tỷ lệ chiếu sáng mặt trăng (Moon Illumination %).</w:t>
+        <w:t xml:space="preserve">   - Chức năng: Dựa trên tọa độ kinh vĩ độ của địa phương đã chốt, hệ thống tính toán chính xác giờ Mặt trời mọc (Sunrise), Mặt trời lặn (Sunset), Mặt trăng mọc (Moonrise), Mặt trăng lặn (Moonset), Tuần trăng (Moon Phase) và Tỷ lệ chiếu sáng mặt trăng (Moon Illumination %).</w:t>
+        <w:br/>
+      </w:r>
+      <w:r>
+        <w:t xml:space="preserve">   - Khắc phục lỗi: Đã loại bỏ dòng code sai loại trừ 'Hà Nội', đảm bảo thẻ thiên văn luôn hiển thị tên thủ đô chuẩn mực, không bao giờ còn bị hiện 'Xóm Trong' hay 'Đình Thôn'.</w:t>
+        <w:br/>
       </w:r>
     </w:p>
     <w:p>
@@ -2277,19 +2336,13 @@
         <w:rPr>
           <w:b/>
         </w:rPr>
-        <w:t>Các dòng code Java then chốt bạn Thùy Trang cần chỉ cho thầy cô xem:</w:t>
+        <w:t>Các đoạn code Java then chốt bạn Thùy Trang cần mở cho giảng viên xem:</w:t>
         <w:br/>
       </w:r>
       <w:r>
-        <w:t xml:space="preserve"> • Xin quyền và lấy tọa độ GPS trong LocationHelper.java:</w:t>
+        <w:t xml:space="preserve"> • 1. Xin quyền và lấy tọa độ GPS trong LocationHelper.java:</w:t>
         <w:br/>
       </w:r>
-    </w:p>
-    <w:p>
-      <w:pPr>
-        <w:spacing w:before="80" w:after="120"/>
-        <w:ind w:left="360" w:right="360"/>
-      </w:pPr>
     </w:p>
     <w:tbl>
       <w:tblPr>
@@ -2298,22 +2351,22 @@
         <w:tblLook w:firstColumn="1" w:firstRow="1" w:lastColumn="0" w:lastRow="0" w:noHBand="0" w:noVBand="1" w:val="04A0"/>
       </w:tblPr>
       <w:tblGrid>
-        <w:gridCol w:w="9648"/>
+        <w:gridCol w:w="9792"/>
       </w:tblGrid>
       <w:tr>
         <w:tc>
           <w:tcPr>
-            <w:tcW w:type="dxa" w:w="9648"/>
-            <w:shd w:fill="F1F5F9"/>
+            <w:tcW w:type="dxa" w:w="9792"/>
+            <w:shd w:fill="F8FAFC"/>
             <w:tcMar>
-              <w:top w:w="120" w:type="dxa"/>
-              <w:bottom w:w="120" w:type="dxa"/>
-              <w:left w:w="180" w:type="dxa"/>
-              <w:right w:w="180" w:type="dxa"/>
+              <w:top w:w="100" w:type="dxa"/>
+              <w:bottom w:w="100" w:type="dxa"/>
+              <w:left w:w="150" w:type="dxa"/>
+              <w:right w:w="150" w:type="dxa"/>
             </w:tcMar>
             <w:tcBorders>
               <w:top w:val="single" w:sz="4" w:space="0" w:color="CBD5E1"/>
-              <w:left w:val="single" w:sz="24" w:space="0" w:color="3B82F6"/>
+              <w:left w:val="single" w:sz="24" w:space="0" w:color="2563EB"/>
               <w:bottom w:val="single" w:sz="4" w:space="0" w:color="CBD5E1"/>
               <w:right w:val="single" w:sz="4" w:space="0" w:color="CBD5E1"/>
             </w:tcBorders>
@@ -2356,20 +2409,14 @@
     </w:tbl>
     <w:p>
       <w:pPr>
-        <w:spacing w:before="40" w:after="40"/>
+        <w:spacing w:before="40" w:after="80"/>
       </w:pPr>
     </w:p>
     <w:p>
       <w:r>
-        <w:t xml:space="preserve"> • Thuật toán khử trạm vi khí hậu thôn xóm trong WeatherUtils.java:</w:t>
+        <w:t xml:space="preserve"> • 2. Thuật toán chuẩn hóa khử trạm thôn xóm trong WeatherUtils.java:</w:t>
         <w:br/>
       </w:r>
-    </w:p>
-    <w:p>
-      <w:pPr>
-        <w:spacing w:before="80" w:after="120"/>
-        <w:ind w:left="360" w:right="360"/>
-      </w:pPr>
     </w:p>
     <w:tbl>
       <w:tblPr>
@@ -2378,22 +2425,22 @@
         <w:tblLook w:firstColumn="1" w:firstRow="1" w:lastColumn="0" w:lastRow="0" w:noHBand="0" w:noVBand="1" w:val="04A0"/>
       </w:tblPr>
       <w:tblGrid>
-        <w:gridCol w:w="9648"/>
+        <w:gridCol w:w="9792"/>
       </w:tblGrid>
       <w:tr>
         <w:tc>
           <w:tcPr>
-            <w:tcW w:type="dxa" w:w="9648"/>
-            <w:shd w:fill="F1F5F9"/>
+            <w:tcW w:type="dxa" w:w="9792"/>
+            <w:shd w:fill="F8FAFC"/>
             <w:tcMar>
-              <w:top w:w="120" w:type="dxa"/>
-              <w:bottom w:w="120" w:type="dxa"/>
-              <w:left w:w="180" w:type="dxa"/>
-              <w:right w:w="180" w:type="dxa"/>
+              <w:top w:w="100" w:type="dxa"/>
+              <w:bottom w:w="100" w:type="dxa"/>
+              <w:left w:w="150" w:type="dxa"/>
+              <w:right w:w="150" w:type="dxa"/>
             </w:tcMar>
             <w:tcBorders>
               <w:top w:val="single" w:sz="4" w:space="0" w:color="CBD5E1"/>
-              <w:left w:val="single" w:sz="24" w:space="0" w:color="3B82F6"/>
+              <w:left w:val="single" w:sz="24" w:space="0" w:color="2563EB"/>
               <w:bottom w:val="single" w:sz="4" w:space="0" w:color="CBD5E1"/>
               <w:right w:val="single" w:sz="4" w:space="0" w:color="CBD5E1"/>
             </w:tcBorders>
@@ -2430,7 +2477,7 @@
     </w:tbl>
     <w:p>
       <w:pPr>
-        <w:spacing w:before="40" w:after="40"/>
+        <w:spacing w:before="40" w:after="80"/>
       </w:pPr>
     </w:p>
     <w:tbl>
@@ -2440,22 +2487,22 @@
         <w:tblLook w:firstColumn="1" w:firstRow="1" w:lastColumn="0" w:lastRow="0" w:noHBand="0" w:noVBand="1" w:val="04A0"/>
       </w:tblPr>
       <w:tblGrid>
-        <w:gridCol w:w="9648"/>
+        <w:gridCol w:w="9792"/>
       </w:tblGrid>
       <w:tr>
         <w:tc>
           <w:tcPr>
-            <w:tcW w:type="dxa" w:w="9648"/>
+            <w:tcW w:type="dxa" w:w="9792"/>
             <w:shd w:fill="EFF6FF"/>
             <w:tcMar>
-              <w:top w:w="140" w:type="dxa"/>
-              <w:bottom w:w="140" w:type="dxa"/>
-              <w:left w:w="200" w:type="dxa"/>
-              <w:right w:w="200" w:type="dxa"/>
+              <w:top w:w="120" w:type="dxa"/>
+              <w:bottom w:w="120" w:type="dxa"/>
+              <w:left w:w="160" w:type="dxa"/>
+              <w:right w:w="160" w:type="dxa"/>
             </w:tcMar>
             <w:tcBorders>
               <w:top w:val="none"/>
-              <w:left w:val="single" w:sz="36" w:space="0" w:color="3B82F6"/>
+              <w:left w:val="single" w:sz="32" w:space="0" w:color="2563EB"/>
               <w:bottom w:val="none"/>
               <w:right w:val="none"/>
             </w:tcBorders>
@@ -2471,7 +2518,7 @@
                 <w:color w:val="1E3A8A"/>
                 <w:sz w:val="21"/>
               </w:rPr>
-              <w:t>🎤 Câu nói mẫu giúp bạn Thùy Trang tự tin thuyết trình:</w:t>
+              <w:t>🎤 Câu nói mẫu giúp bạn Thùy Trang mở đầu thuyết trình ăn điểm tuyệt đối:</w:t>
               <w:br/>
             </w:r>
             <w:r>
@@ -2480,7 +2527,7 @@
                 <w:color w:val="1E293B"/>
                 <w:sz w:val="20"/>
               </w:rPr>
-              <w:t>"Thưa thầy cô, em đảm nhiệm hệ thống định vị vệ tinh toàn cầu GPS, cơ sở dữ liệu tra cứu 63 tỉnh thành Việt Nam và mô-đun thiên văn học mặt trời mặt trăng gắn liền với tọa độ địa lý. Điểm kỹ thuật nổi bật nhất trong phần của em là em đã giải quyết triệt để lỗi định vị hiển thị tên thôn xóm nhỏ (như Đình Thôn hay Xóm Trong) bằng thuật toán kiểm soát ranh giới tọa độ trong WeatherUtils.java và VietnamLocations.java, luôn đảm bảo hiển thị tên Thành phố trung tâm chuẩn mực."</w:t>
+              <w:t>"Thưa thầy cô, em đảm nhiệm hệ thống định vị vệ tinh GPS, cơ sở dữ liệu tra cứu 63 tỉnh thành Việt Nam và mô-đun thiên văn học mặt trời mặt trăng gắn liền với tọa độ địa lý. Điểm kỹ thuật nổi bật nhất trong phần của em là em đã giải quyết triệt để lỗi định vị hiển thị tên thôn xóm nhỏ (như Đình Thôn hay Xóm Trong) bằng thuật toán kiểm soát ranh giới tọa độ trong WeatherUtils.java và VietnamLocations.java, luôn đảm bảo hiển thị tên Thành phố trung tâm chuẩn mực ạ."</w:t>
             </w:r>
           </w:p>
         </w:tc>
@@ -2495,13 +2542,13 @@
       <w:pPr>
         <w:pStyle w:val="Heading2"/>
         <w:keepNext/>
-        <w:spacing w:before="240" w:after="120"/>
+        <w:spacing w:before="280" w:after="120"/>
       </w:pPr>
       <w:r>
         <w:rPr>
           <w:b/>
-          <w:color w:val="2A52BE"/>
-          <w:sz w:val="26"/>
+          <w:color w:val="2563EB"/>
+          <w:sz w:val="25"/>
         </w:rPr>
         <w:t>4. Thành Viên 4: BẠN AN THẠCH — Phụ Trách So Sánh Khí Hậu, Chi Tiết &amp; Thiên Tai (4 Màn Hình)</w:t>
       </w:r>
@@ -2511,7 +2558,7 @@
         <w:rPr>
           <w:b/>
         </w:rPr>
-        <w:t xml:space="preserve">Vai trò chính: </w:t>
+        <w:t xml:space="preserve">Mảng chuyên môn: </w:t>
       </w:r>
       <w:r>
         <w:t>Phát triển các công cụ phân tích đối chiếu khí hậu giữa 2 địa phương, tra cứu thông số khí tượng chuyên sâu, hệ thống radar cảnh báo thời tiết nguy hiểm và trung tâm kỹ năng sinh tồn tích hợp gọi điện cứu hộ khẩn cấp.</w:t>
@@ -2522,47 +2569,52 @@
         <w:rPr>
           <w:b/>
         </w:rPr>
-        <w:t>Chi tiết 4 màn hình đảm nhiệm (Màn 12 -&gt; Màn 15):</w:t>
+        <w:t>Phân tích chi tiết 4 màn hình đảm nhiệm:</w:t>
         <w:br/>
       </w:r>
       <w:r>
         <w:rPr>
           <w:b/>
         </w:rPr>
-        <w:t xml:space="preserve"> • Màn 12: WeatherCompareActivity (Màn hình So Sánh Thời Tiết 2 Địa Điểm): </w:t>
+        <w:t xml:space="preserve"> • Màn 12: WeatherCompareActivity (So Sánh Thời Tiết 2 Địa Điểm — activity_weather_compare.xml):</w:t>
+        <w:br/>
       </w:r>
       <w:r>
-        <w:t>Cho phép chọn đồng thời 2 tỉnh thành bất kỳ (VD: Hà Nội và TP.HCM) để so sánh trực quan. Bảng chỉ số đối chiếu: Nhiệt độ, Độ ẩm, Sức gió, Khí áp, Tầm nhìn, Tỷ lệ mây. Tự động tính toán độ chênh lệch nhiệt độ Delta-T để biết nơi nào nóng hơn, ẩm hơn nhằm chuẩn bị hành lý khi di chuyển.</w:t>
+        <w:t xml:space="preserve">   - Chức năng: Cho phép chọn đồng thời 2 tỉnh thành bất kỳ (VD: Hà Nội và TP.HCM) để so sánh trực quan trên cùng màn hình. Bảng chỉ số đối chiếu: Nhiệt độ, Độ ẩm, Sức gió, Khí áp, Tầm nhìn, Tỷ lệ mây. Tự động tính toán độ chênh lệch nhiệt độ Delta-T để biết nơi nào nóng hơn, ẩm hơn nhằm chuẩn bị hành lý khi di chuyển.</w:t>
         <w:br/>
       </w:r>
       <w:r>
         <w:rPr>
           <w:b/>
         </w:rPr>
-        <w:t xml:space="preserve"> • Màn 13: WeatherAlertsActivity (Radar Cảnh Báo Thiên Tai &amp; Thời Tiết Cực Đoan): </w:t>
+        <w:t xml:space="preserve"> • Màn 13: WeatherAlertsActivity (Radar Cảnh Báo Thiên Tai &amp; Thời Tiết Cực Đoan — activity_weather_alerts.xml):</w:t>
+        <w:br/>
       </w:r>
       <w:r>
-        <w:t>Tiếp nhận và phát tín hiệu cảnh báo dông lốc, mưa lớn ngập lụt, sóng nhiệt nắng nóng, bão nhiệt đới. Phân cấp mức độ nguy hiểm theo 4 cấp màu trực quan: Xanh (Bình thường), Vàng (Chú ý), Cam (Nguy hiểm), Đỏ (Cực kỳ nguy hiểm / Khẩn cấp).</w:t>
+        <w:t xml:space="preserve">   - Chức năng: Tiếp nhận và phát tín hiệu cảnh báo dông lốc, mưa lớn ngập lụt, sóng nhiệt nắng nóng, bão nhiệt đới. Phân cấp mức độ nguy hiểm theo 4 cấp màu trực quan: Xanh (Bình thường), Vàng (Chú ý), Cam (Nguy hiểm), Đỏ (Cực kỳ nguy hiểm / Khẩn cấp).</w:t>
         <w:br/>
       </w:r>
       <w:r>
         <w:rPr>
           <w:b/>
         </w:rPr>
-        <w:t xml:space="preserve"> • Màn 14: DisasterGuideActivity (Cẩm Nang Kỹ Năng Sinh Tồn &amp; Số Cứu Hộ Khẩn Cấp): </w:t>
+        <w:t xml:space="preserve"> • Màn 14: DisasterGuideActivity (Cẩm Nang Kỹ Năng Sinh Tồn &amp; Số Cứu Hộ Khẩn Cấp — activity_disaster_guide.xml):</w:t>
+        <w:br/>
       </w:r>
       <w:r>
-        <w:t>Cung cấp hướng dẫn sinh tồn khi xảy ra 5 thảm họa thiên nhiên phổ biến: Bão lũ - Lốc xoáy - Sấm sét - Động đất - Hỏa hoạn. Tích hợp nút gọi điện 1 chạm đến các tổng đài cứu nạn quốc gia (112 - Tìm kiếm cứu nạn, 114 - Cứu hỏa cứu nạn, 115 - Cấp cứu y tế).</w:t>
+        <w:t xml:space="preserve">   - Chức năng: Cung cấp hướng dẫn sinh tồn khi xảy ra 5 thảm họa thiên nhiên phổ biến: Bão lũ - Lốc xoáy - Sấm sét - Động đất - Hỏa hoạn. Tích hợp nút gọi điện 1 chạm đến các tổng đài cứu nạn quốc gia (112 - Tìm kiếm cứu nạn, 114 - Cứu hỏa cứu nạn, 115 - Cấp cứu y tế).</w:t>
         <w:br/>
       </w:r>
       <w:r>
         <w:rPr>
           <w:b/>
         </w:rPr>
-        <w:t xml:space="preserve"> • Màn 15: DetailActivity (Màn hình Chi Tiết Khí Tượng Chuyên Sâu): </w:t>
+        <w:t xml:space="preserve"> • Màn 15: DetailActivity (Màn hình Chi Tiết Khí Tượng Chuyên Sâu — activity_details.xml):</w:t>
+        <w:br/>
       </w:r>
       <w:r>
-        <w:t>Cung cấp các thông số kỹ thuật phục vụ cảnh báo thiên tai: Áp suất khí quyển (mbar / inHg), Nhiệt độ điểm sương (Dew Point), Tầm nhìn xa (km / dặm), Tốc độ và hướng gió theo 16 phương vị la bàn.</w:t>
+        <w:t xml:space="preserve">   - Chức năng: Cung cấp các thông số kỹ thuật phục vụ cảnh báo thiên tai: Áp suất khí quyển (mbar / inHg), Nhiệt độ điểm sương (Dew Point), Tầm nhìn xa (km / dặm), Tốc độ và hướng gió theo 16 phương vị la bàn.</w:t>
+        <w:br/>
       </w:r>
     </w:p>
     <w:p>
@@ -2570,19 +2622,13 @@
         <w:rPr>
           <w:b/>
         </w:rPr>
-        <w:t>Các dòng code Java then chốt bạn An Thạch cần chỉ cho thầy cô xem:</w:t>
+        <w:t>Các đoạn code Java then chốt bạn An Thạch cần mở cho giảng viên xem:</w:t>
         <w:br/>
       </w:r>
       <w:r>
-        <w:t xml:space="preserve"> • Thuật toán tính chênh lệch trong WeatherCompareActivity.java:</w:t>
+        <w:t xml:space="preserve"> • 1. Thuật toán tính chênh lệch trong WeatherCompareActivity.java:</w:t>
         <w:br/>
       </w:r>
-    </w:p>
-    <w:p>
-      <w:pPr>
-        <w:spacing w:before="80" w:after="120"/>
-        <w:ind w:left="360" w:right="360"/>
-      </w:pPr>
     </w:p>
     <w:tbl>
       <w:tblPr>
@@ -2591,22 +2637,22 @@
         <w:tblLook w:firstColumn="1" w:firstRow="1" w:lastColumn="0" w:lastRow="0" w:noHBand="0" w:noVBand="1" w:val="04A0"/>
       </w:tblPr>
       <w:tblGrid>
-        <w:gridCol w:w="9648"/>
+        <w:gridCol w:w="9792"/>
       </w:tblGrid>
       <w:tr>
         <w:tc>
           <w:tcPr>
-            <w:tcW w:type="dxa" w:w="9648"/>
-            <w:shd w:fill="F1F5F9"/>
+            <w:tcW w:type="dxa" w:w="9792"/>
+            <w:shd w:fill="F8FAFC"/>
             <w:tcMar>
-              <w:top w:w="120" w:type="dxa"/>
-              <w:bottom w:w="120" w:type="dxa"/>
-              <w:left w:w="180" w:type="dxa"/>
-              <w:right w:w="180" w:type="dxa"/>
+              <w:top w:w="100" w:type="dxa"/>
+              <w:bottom w:w="100" w:type="dxa"/>
+              <w:left w:w="150" w:type="dxa"/>
+              <w:right w:w="150" w:type="dxa"/>
             </w:tcMar>
             <w:tcBorders>
               <w:top w:val="single" w:sz="4" w:space="0" w:color="CBD5E1"/>
-              <w:left w:val="single" w:sz="24" w:space="0" w:color="3B82F6"/>
+              <w:left w:val="single" w:sz="24" w:space="0" w:color="2563EB"/>
               <w:bottom w:val="single" w:sz="4" w:space="0" w:color="CBD5E1"/>
               <w:right w:val="single" w:sz="4" w:space="0" w:color="CBD5E1"/>
             </w:tcBorders>
@@ -2637,20 +2683,14 @@
     </w:tbl>
     <w:p>
       <w:pPr>
-        <w:spacing w:before="40" w:after="40"/>
+        <w:spacing w:before="40" w:after="80"/>
       </w:pPr>
     </w:p>
     <w:p>
       <w:r>
-        <w:t xml:space="preserve"> • Tích hợp gọi điện khẩn cấp bằng Intent trong DisasterGuideActivity.java:</w:t>
+        <w:t xml:space="preserve"> • 2. Tích hợp gọi điện khẩn cấp bằng Intent trong DisasterGuideActivity.java:</w:t>
         <w:br/>
       </w:r>
-    </w:p>
-    <w:p>
-      <w:pPr>
-        <w:spacing w:before="80" w:after="120"/>
-        <w:ind w:left="360" w:right="360"/>
-      </w:pPr>
     </w:p>
     <w:tbl>
       <w:tblPr>
@@ -2659,22 +2699,22 @@
         <w:tblLook w:firstColumn="1" w:firstRow="1" w:lastColumn="0" w:lastRow="0" w:noHBand="0" w:noVBand="1" w:val="04A0"/>
       </w:tblPr>
       <w:tblGrid>
-        <w:gridCol w:w="9648"/>
+        <w:gridCol w:w="9792"/>
       </w:tblGrid>
       <w:tr>
         <w:tc>
           <w:tcPr>
-            <w:tcW w:type="dxa" w:w="9648"/>
-            <w:shd w:fill="F1F5F9"/>
+            <w:tcW w:type="dxa" w:w="9792"/>
+            <w:shd w:fill="F8FAFC"/>
             <w:tcMar>
-              <w:top w:w="120" w:type="dxa"/>
-              <w:bottom w:w="120" w:type="dxa"/>
-              <w:left w:w="180" w:type="dxa"/>
-              <w:right w:w="180" w:type="dxa"/>
+              <w:top w:w="100" w:type="dxa"/>
+              <w:bottom w:w="100" w:type="dxa"/>
+              <w:left w:w="150" w:type="dxa"/>
+              <w:right w:w="150" w:type="dxa"/>
             </w:tcMar>
             <w:tcBorders>
               <w:top w:val="single" w:sz="4" w:space="0" w:color="CBD5E1"/>
-              <w:left w:val="single" w:sz="24" w:space="0" w:color="3B82F6"/>
+              <w:left w:val="single" w:sz="24" w:space="0" w:color="2563EB"/>
               <w:bottom w:val="single" w:sz="4" w:space="0" w:color="CBD5E1"/>
               <w:right w:val="single" w:sz="4" w:space="0" w:color="CBD5E1"/>
             </w:tcBorders>
@@ -2703,7 +2743,7 @@
     </w:tbl>
     <w:p>
       <w:pPr>
-        <w:spacing w:before="40" w:after="40"/>
+        <w:spacing w:before="40" w:after="80"/>
       </w:pPr>
     </w:p>
     <w:tbl>
@@ -2713,22 +2753,22 @@
         <w:tblLook w:firstColumn="1" w:firstRow="1" w:lastColumn="0" w:lastRow="0" w:noHBand="0" w:noVBand="1" w:val="04A0"/>
       </w:tblPr>
       <w:tblGrid>
-        <w:gridCol w:w="9648"/>
+        <w:gridCol w:w="9792"/>
       </w:tblGrid>
       <w:tr>
         <w:tc>
           <w:tcPr>
-            <w:tcW w:type="dxa" w:w="9648"/>
+            <w:tcW w:type="dxa" w:w="9792"/>
             <w:shd w:fill="EFF6FF"/>
             <w:tcMar>
-              <w:top w:w="140" w:type="dxa"/>
-              <w:bottom w:w="140" w:type="dxa"/>
-              <w:left w:w="200" w:type="dxa"/>
-              <w:right w:w="200" w:type="dxa"/>
+              <w:top w:w="120" w:type="dxa"/>
+              <w:bottom w:w="120" w:type="dxa"/>
+              <w:left w:w="160" w:type="dxa"/>
+              <w:right w:w="160" w:type="dxa"/>
             </w:tcMar>
             <w:tcBorders>
               <w:top w:val="none"/>
-              <w:left w:val="single" w:sz="36" w:space="0" w:color="3B82F6"/>
+              <w:left w:val="single" w:sz="32" w:space="0" w:color="2563EB"/>
               <w:bottom w:val="none"/>
               <w:right w:val="none"/>
             </w:tcBorders>
@@ -2744,7 +2784,7 @@
                 <w:color w:val="1E3A8A"/>
                 <w:sz w:val="21"/>
               </w:rPr>
-              <w:t>🎤 Câu nói mẫu giúp bạn An Thạch tự tin thuyết trình:</w:t>
+              <w:t>🎤 Câu nói mẫu giúp bạn An Thạch mở đầu thuyết trình ăn điểm tuyệt đối:</w:t>
               <w:br/>
             </w:r>
             <w:r>
@@ -2753,7 +2793,7 @@
                 <w:color w:val="1E293B"/>
                 <w:sz w:val="20"/>
               </w:rPr>
-              <w:t>"Thưa thầy cô, em phụ trách các tính năng phân tích khí hậu liên vùng, tra cứu số liệu khí quyển chuyên sâu và trung tâm an toàn thiên tai. Tính năng So sánh thời tiết của em mang giá trị thực tiễn rất cao cho du lịch và logistics. Đặc biệt, cẩm nang sinh tồn của em đã tích hợp phần cứng bàn phím gọi điện khẩn cấp 112, 114, 115 bằng Intent.ACTION_DIAL kết hợp màn hình DetailActivity hiển thị áp suất khí quyển để cảnh báo sớm vùng áp thấp nhiệt đới."</w:t>
+              <w:t>"Thưa thầy cô, em phụ trách các tính năng phân tích khí hậu liên vùng, tra cứu số liệu khí quyển chuyên sâu và trung tâm an toàn thiên tai. Tính năng So sánh thời tiết của em mang giá trị thực tiễn rất cao cho du lịch và logistics. Đặc biệt, cẩm nang sinh tồn của em đã tích hợp phần cứng bàn phím gọi điện khẩn cấp 112, 114, 115 bằng Intent.ACTION_DIAL kết hợp màn hình DetailActivity hiển thị áp suất khí quyển để cảnh báo sớm vùng áp thấp nhiệt đới ạ."</w:t>
             </w:r>
           </w:p>
         </w:tc>
@@ -2768,13 +2808,13 @@
       <w:pPr>
         <w:pStyle w:val="Heading2"/>
         <w:keepNext/>
-        <w:spacing w:before="240" w:after="120"/>
+        <w:spacing w:before="280" w:after="120"/>
       </w:pPr>
       <w:r>
         <w:rPr>
           <w:b/>
-          <w:color w:val="2A52BE"/>
-          <w:sz w:val="26"/>
+          <w:color w:val="2563EB"/>
+          <w:sz w:val="25"/>
         </w:rPr>
         <w:t>5. Thành Viên 5: BẠN DŨNG — Phụ Trách Chất Lượng Không Khí, Sức Khỏe &amp; Cài Đặt Hệ Thống (3 Màn Hình)</w:t>
       </w:r>
@@ -2784,7 +2824,7 @@
         <w:rPr>
           <w:b/>
         </w:rPr>
-        <w:t xml:space="preserve">Vai trò chính: </w:t>
+        <w:t xml:space="preserve">Mảng chuyên môn: </w:t>
       </w:r>
       <w:r>
         <w:t>Xây dựng mô-đun quan trắc môi trường AQI, trợ lý tư vấn sức khỏe phong cách sống và thiết kế kiến trúc nền tảng BaseActivity đồng bộ Dark Mode và Đa ngôn ngữ cho toàn bộ 18 màn hình.</w:t>
@@ -2795,47 +2835,45 @@
         <w:rPr>
           <w:b/>
         </w:rPr>
-        <w:t>Chi tiết 3 màn hình đảm nhiệm (Màn 16 -&gt; Màn 18):</w:t>
+        <w:t>Phân tích chi tiết 3 màn hình đảm nhiệm:</w:t>
         <w:br/>
       </w:r>
       <w:r>
         <w:rPr>
           <w:b/>
         </w:rPr>
-        <w:t xml:space="preserve"> • Màn 16: AirQualityActivity (Màn hình Giám Sát Chất Lượng Không Khí AQI): </w:t>
+        <w:t xml:space="preserve"> • Màn 16: AirQualityActivity (Màn hình Giám Sát Chất Lượng Không Khí AQI — activity_air_quality.xml):</w:t>
+        <w:br/>
       </w:r>
       <w:r>
-        <w:t>Đo lường chỉ số ô nhiễm không khí theo tiêu chuẩn US-EPA Index (thang điểm 1 đến 6). Phân tích chi tiết nồng độ bụi siêu mịn PM2.5, bụi thô PM10, khí độc CO, NO2, SO2, O3 và đưa ra khuyến cáo y tế đeo khẩu trang bảo vệ đường hô hấp.</w:t>
+        <w:t xml:space="preserve">   - Chức năng: Đo lường chỉ số ô nhiễm không khí theo tiêu chuẩn US-EPA Index (thang điểm 1 đến 6). Phân tích chi tiết nồng độ bụi siêu mịn PM2.5, bụi thô PM10, khí độc CO, NO2, SO2, O3 và đưa ra khuyến cáo y tế đeo khẩu trang bảo vệ đường hô hấp.</w:t>
         <w:br/>
       </w:r>
       <w:r>
         <w:rPr>
           <w:b/>
         </w:rPr>
-        <w:t xml:space="preserve"> • Màn 17: LifestyleAdviceActivity (Trợ Lý Sức Khỏe &amp; Lối Sống Thông Minh): </w:t>
+        <w:t xml:space="preserve"> • Màn 17: LifestyleAdviceActivity (Trợ Lý Sức Khỏe &amp; Lối Sống Thông Minh — activity_lifestyle_advice.xml):</w:t>
+        <w:br/>
       </w:r>
       <w:r>
-        <w:t>Đưa ra lời khuyên sinh hoạt cá nhân hóa: Trang phục hôm nay (mặc ấm hay thoáng mát), Khả năng phơi quần áo ngoài trời, Cảnh báo tia cực tím UV và bôi kem chống nắng, Đánh giá điều kiện tập thể thao ngoài trời.</w:t>
+        <w:t xml:space="preserve">   - Chức năng: Đưa ra lời khuyên sinh hoạt cá nhân hóa: Trang phục hôm nay (mặc ấm hay thoáng mát), Khả năng phơi quần áo ngoài trời, Cảnh báo tia cực tím UV và bôi kem chống nắng, Đánh giá điều kiện tập thể thao ngoài trời.</w:t>
         <w:br/>
       </w:r>
       <w:r>
         <w:rPr>
           <w:b/>
         </w:rPr>
-        <w:t xml:space="preserve"> • Màn 18: SettingsActivity (Cài Đặt Hệ Thống Ứng Dụng): </w:t>
-      </w:r>
-      <w:r>
-        <w:t>Chuyển đổi giao diện Sáng / Tối (Dark Mode); Đổi đơn vị nhiệt độ (°C / °F); Đổi đơn vị gió; Đổi ngôn ngữ toàn bộ app sang Tiếng Việt (VI) hoặc Tiếng Anh (EN).</w:t>
+        <w:t xml:space="preserve"> • Màn 18: SettingsActivity (Cài Đặt Hệ Thống Ứng Dụng — activity_settings.xml):</w:t>
         <w:br/>
       </w:r>
       <w:r>
-        <w:rPr>
-          <w:b/>
-        </w:rPr>
-        <w:t xml:space="preserve"> • Lớp kiến trúc nền tảng BaseActivity.java &amp; Tiện ích WeatherUtils.java: </w:t>
+        <w:t xml:space="preserve">   - Chức năng: Chuyển đổi giao diện Sáng / Tối (Dark Mode); Đổi đơn vị nhiệt độ (°C / °F); Đổi đơn vị gió; Đổi ngôn ngữ toàn bộ app sang Tiếng Việt (VI) hoặc Tiếng Anh (EN).</w:t>
+        <w:br/>
       </w:r>
       <w:r>
-        <w:t>Xây dựng kiến trúc kế thừa chung cho toàn bộ 18 màn hình, giúp áp dụng Dark Mode và đa ngôn ngữ tự động trên toàn app.</w:t>
+        <w:t xml:space="preserve">   - Lớp kiến trúc nền tảng BaseActivity.java &amp; Tiện ích WeatherUtils.java: Xây dựng kiến trúc kế thừa chung cho toàn bộ 18 màn hình, giúp áp dụng Dark Mode và đa ngôn ngữ tự động trên toàn app.</w:t>
+        <w:br/>
       </w:r>
     </w:p>
     <w:p>
@@ -2843,19 +2881,13 @@
         <w:rPr>
           <w:b/>
         </w:rPr>
-        <w:t>Các dòng code Java then chốt bạn Dũng cần chỉ cho thầy cô xem:</w:t>
+        <w:t>Các đoạn code Java then chốt bạn Dũng cần mở cho giảng viên xem:</w:t>
         <w:br/>
       </w:r>
       <w:r>
-        <w:t xml:space="preserve"> • Kiến trúc nền tảng BaseActivity.java tự động áp dụng Dark Mode và Ngôn ngữ:</w:t>
+        <w:t xml:space="preserve"> • 1. Kiến trúc nền tảng BaseActivity.java tự động áp dụng Dark Mode và Ngôn ngữ:</w:t>
         <w:br/>
       </w:r>
-    </w:p>
-    <w:p>
-      <w:pPr>
-        <w:spacing w:before="80" w:after="120"/>
-        <w:ind w:left="360" w:right="360"/>
-      </w:pPr>
     </w:p>
     <w:tbl>
       <w:tblPr>
@@ -2864,22 +2896,22 @@
         <w:tblLook w:firstColumn="1" w:firstRow="1" w:lastColumn="0" w:lastRow="0" w:noHBand="0" w:noVBand="1" w:val="04A0"/>
       </w:tblPr>
       <w:tblGrid>
-        <w:gridCol w:w="9648"/>
+        <w:gridCol w:w="9792"/>
       </w:tblGrid>
       <w:tr>
         <w:tc>
           <w:tcPr>
-            <w:tcW w:type="dxa" w:w="9648"/>
-            <w:shd w:fill="F1F5F9"/>
+            <w:tcW w:type="dxa" w:w="9792"/>
+            <w:shd w:fill="F8FAFC"/>
             <w:tcMar>
-              <w:top w:w="120" w:type="dxa"/>
-              <w:bottom w:w="120" w:type="dxa"/>
-              <w:left w:w="180" w:type="dxa"/>
-              <w:right w:w="180" w:type="dxa"/>
+              <w:top w:w="100" w:type="dxa"/>
+              <w:bottom w:w="100" w:type="dxa"/>
+              <w:left w:w="150" w:type="dxa"/>
+              <w:right w:w="150" w:type="dxa"/>
             </w:tcMar>
             <w:tcBorders>
               <w:top w:val="single" w:sz="4" w:space="0" w:color="CBD5E1"/>
-              <w:left w:val="single" w:sz="24" w:space="0" w:color="3B82F6"/>
+              <w:left w:val="single" w:sz="24" w:space="0" w:color="2563EB"/>
               <w:bottom w:val="single" w:sz="4" w:space="0" w:color="CBD5E1"/>
               <w:right w:val="single" w:sz="4" w:space="0" w:color="CBD5E1"/>
             </w:tcBorders>
@@ -2928,8 +2960,14 @@
     </w:tbl>
     <w:p>
       <w:pPr>
-        <w:spacing w:before="40" w:after="40"/>
+        <w:spacing w:before="40" w:after="80"/>
       </w:pPr>
+    </w:p>
+    <w:p>
+      <w:r>
+        <w:t xml:space="preserve"> • 2. Thuật toán chuyển đổi nhiệt độ linh hoạt trong WeatherUtils.java:</w:t>
+        <w:br/>
+      </w:r>
     </w:p>
     <w:tbl>
       <w:tblPr>
@@ -2938,92 +2976,22 @@
         <w:tblLook w:firstColumn="1" w:firstRow="1" w:lastColumn="0" w:lastRow="0" w:noHBand="0" w:noVBand="1" w:val="04A0"/>
       </w:tblPr>
       <w:tblGrid>
-        <w:gridCol w:w="9648"/>
+        <w:gridCol w:w="9792"/>
       </w:tblGrid>
       <w:tr>
         <w:tc>
           <w:tcPr>
-            <w:tcW w:type="dxa" w:w="9648"/>
-            <w:shd w:fill="EFF6FF"/>
+            <w:tcW w:type="dxa" w:w="9792"/>
+            <w:shd w:fill="F8FAFC"/>
             <w:tcMar>
-              <w:top w:w="140" w:type="dxa"/>
-              <w:bottom w:w="140" w:type="dxa"/>
-              <w:left w:w="200" w:type="dxa"/>
-              <w:right w:w="200" w:type="dxa"/>
-            </w:tcMar>
-            <w:tcBorders>
-              <w:top w:val="none"/>
-              <w:left w:val="single" w:sz="36" w:space="0" w:color="3B82F6"/>
-              <w:bottom w:val="none"/>
-              <w:right w:val="none"/>
-            </w:tcBorders>
-          </w:tcPr>
-          <w:p>
-            <w:pPr>
-              <w:spacing w:before="0" w:after="40"/>
-            </w:pPr>
-            <w:r>
-              <w:rPr>
-                <w:rFonts w:ascii="Arial" w:hAnsi="Arial"/>
-                <w:b/>
-                <w:color w:val="1E3A8A"/>
-                <w:sz w:val="21"/>
-              </w:rPr>
-              <w:t>🎤 Câu nói mẫu giúp bạn Dũng tự tin thuyết trình:</w:t>
-              <w:br/>
-            </w:r>
-            <w:r>
-              <w:rPr>
-                <w:rFonts w:ascii="Arial" w:hAnsi="Arial"/>
-                <w:color w:val="1E293B"/>
-                <w:sz w:val="20"/>
-              </w:rPr>
-              <w:t>"Thưa thầy cô, em phụ trách mảng đo lường chất lượng không khí, chăm sóc sức khỏe cộng đồng và kiến trúc nền tảng của hệ thống. Em đã áp dụng thang đo tiêu chuẩn US-EPA để cảnh báo nồng độ bụi mịn PM2.5 và PM10 cho người dân. Đặc biệt về mặt kỹ thuật, em đã thiết kế lớp BaseActivity.java làm khung xương cho tất cả 18 màn hình, giúp việc chuyển đổi Chế độ Tối (Dark Mode) và Song ngữ Việt - Anh diễn ra hoàn toàn tự động, tức thì và đồng bộ 100% trên toàn ứng dụng."</w:t>
-            </w:r>
-          </w:p>
-        </w:tc>
-      </w:tr>
-    </w:tbl>
-    <w:p>
-      <w:pPr>
-        <w:spacing w:before="40" w:after="80"/>
-      </w:pPr>
-    </w:p>
-    <w:p>
-      <w:r>
-        <w:t xml:space="preserve"> • Thuật toán chuyển đổi nhiệt độ linh hoạt trong WeatherUtils.java:</w:t>
-        <w:br/>
-      </w:r>
-    </w:p>
-    <w:p>
-      <w:pPr>
-        <w:spacing w:before="80" w:after="120"/>
-        <w:ind w:left="360" w:right="360"/>
-      </w:pPr>
-    </w:p>
-    <w:tbl>
-      <w:tblPr>
-        <w:tblW w:type="auto" w:w="0"/>
-        <w:jc w:val="center"/>
-        <w:tblLook w:firstColumn="1" w:firstRow="1" w:lastColumn="0" w:lastRow="0" w:noHBand="0" w:noVBand="1" w:val="04A0"/>
-      </w:tblPr>
-      <w:tblGrid>
-        <w:gridCol w:w="9648"/>
-      </w:tblGrid>
-      <w:tr>
-        <w:tc>
-          <w:tcPr>
-            <w:tcW w:type="dxa" w:w="9648"/>
-            <w:shd w:fill="F1F5F9"/>
-            <w:tcMar>
-              <w:top w:w="120" w:type="dxa"/>
-              <w:bottom w:w="120" w:type="dxa"/>
-              <w:left w:w="180" w:type="dxa"/>
-              <w:right w:w="180" w:type="dxa"/>
+              <w:top w:w="100" w:type="dxa"/>
+              <w:bottom w:w="100" w:type="dxa"/>
+              <w:left w:w="150" w:type="dxa"/>
+              <w:right w:w="150" w:type="dxa"/>
             </w:tcMar>
             <w:tcBorders>
               <w:top w:val="single" w:sz="4" w:space="0" w:color="CBD5E1"/>
-              <w:left w:val="single" w:sz="24" w:space="0" w:color="3B82F6"/>
+              <w:left w:val="single" w:sz="24" w:space="0" w:color="2563EB"/>
               <w:bottom w:val="single" w:sz="4" w:space="0" w:color="CBD5E1"/>
               <w:right w:val="single" w:sz="4" w:space="0" w:color="CBD5E1"/>
             </w:tcBorders>
@@ -3058,7 +3026,7 @@
     </w:tbl>
     <w:p>
       <w:pPr>
-        <w:spacing w:before="40" w:after="40"/>
+        <w:spacing w:before="40" w:after="80"/>
       </w:pPr>
     </w:p>
     <w:tbl>
@@ -3068,22 +3036,22 @@
         <w:tblLook w:firstColumn="1" w:firstRow="1" w:lastColumn="0" w:lastRow="0" w:noHBand="0" w:noVBand="1" w:val="04A0"/>
       </w:tblPr>
       <w:tblGrid>
-        <w:gridCol w:w="9648"/>
+        <w:gridCol w:w="9792"/>
       </w:tblGrid>
       <w:tr>
         <w:tc>
           <w:tcPr>
-            <w:tcW w:type="dxa" w:w="9648"/>
+            <w:tcW w:type="dxa" w:w="9792"/>
             <w:shd w:fill="EFF6FF"/>
             <w:tcMar>
-              <w:top w:w="140" w:type="dxa"/>
-              <w:bottom w:w="140" w:type="dxa"/>
-              <w:left w:w="200" w:type="dxa"/>
-              <w:right w:w="200" w:type="dxa"/>
+              <w:top w:w="120" w:type="dxa"/>
+              <w:bottom w:w="120" w:type="dxa"/>
+              <w:left w:w="160" w:type="dxa"/>
+              <w:right w:w="160" w:type="dxa"/>
             </w:tcMar>
             <w:tcBorders>
               <w:top w:val="none"/>
-              <w:left w:val="single" w:sz="36" w:space="0" w:color="3B82F6"/>
+              <w:left w:val="single" w:sz="32" w:space="0" w:color="2563EB"/>
               <w:bottom w:val="none"/>
               <w:right w:val="none"/>
             </w:tcBorders>
@@ -3099,7 +3067,7 @@
                 <w:color w:val="1E3A8A"/>
                 <w:sz w:val="21"/>
               </w:rPr>
-              <w:t>🎤 Câu nói mẫu giúp bạn Dũng tự tin thuyết trình:</w:t>
+              <w:t>🎤 Câu nói mẫu giúp bạn Dũng mở đầu thuyết trình ăn điểm tuyệt đối:</w:t>
               <w:br/>
             </w:r>
             <w:r>
@@ -3108,7 +3076,7 @@
                 <w:color w:val="1E293B"/>
                 <w:sz w:val="20"/>
               </w:rPr>
-              <w:t>"Thưa thầy cô, em phụ trách mảng đo lường chất lượng không khí, chăm sóc sức khỏe cộng đồng và kiến trúc nền tảng của hệ thống. Em đã áp dụng thang đo tiêu chuẩn US-EPA để cảnh báo nồng độ bụi mịn PM2.5 và PM10 cho người dân. Đặc biệt về mặt kỹ thuật, em đã thiết kế lớp BaseActivity.java làm khung xương cho tất cả 18 màn hình, giúp việc chuyển đổi Chế độ Tối (Dark Mode) và Song ngữ Việt - Anh diễn ra hoàn toàn tự động, tức thì và đồng bộ 100% trên toàn ứng dụng."</w:t>
+              <w:t>"Thưa thầy cô, em phụ trách mảng đo lường chất lượng không khí, chăm sóc sức khỏe cộng đồng và kiến trúc nền tảng của hệ thống. Em đã áp dụng thang đo tiêu chuẩn US-EPA để cảnh báo nồng độ bụi mịn PM2.5 và PM10 cho người dân. Đặc biệt về mặt kỹ thuật, em đã thiết kế lớp BaseActivity.java làm khung xương cho tất cả 18 màn hình, giúp việc chuyển đổi Chế độ Tối (Dark Mode) và Song ngữ Việt - Anh diễn ra hoàn toàn tự động, tức thì và đồng bộ 100% trên toàn ứng dụng ạ."</w:t>
             </w:r>
           </w:p>
         </w:tc>
@@ -3123,28 +3091,28 @@
       <w:pPr>
         <w:pStyle w:val="Heading1"/>
         <w:keepNext/>
-        <w:spacing w:before="240" w:after="120"/>
+        <w:spacing w:before="280" w:after="120"/>
       </w:pPr>
       <w:r>
         <w:rPr>
           <w:b/>
           <w:color w:val="1B365D"/>
-          <w:sz w:val="32"/>
+          <w:sz w:val="30"/>
         </w:rPr>
-        <w:t>PHẦN IV: BỘ CÂU HỎI &amp; ĐÁP ÁN PHẢN BIỆN TRƯỚC GIẢNG VIÊN</w:t>
+        <w:t>CHƯƠNG IV: BỘ CÂU HỎI &amp; ĐÁP ÁN BẢO VỆ PHẢN BIỆN TRƯỚC GIẢNG VIÊN</w:t>
       </w:r>
     </w:p>
     <w:p>
       <w:pPr>
         <w:pStyle w:val="Heading2"/>
         <w:keepNext/>
-        <w:spacing w:before="240" w:after="120"/>
+        <w:spacing w:before="280" w:after="120"/>
       </w:pPr>
       <w:r>
         <w:rPr>
           <w:b/>
-          <w:color w:val="2A52BE"/>
-          <w:sz w:val="26"/>
+          <w:color w:val="2563EB"/>
+          <w:sz w:val="25"/>
         </w:rPr>
         <w:t>Câu 1: Tại sao chạy trên máy ảo Android Studio rất mượt mà khi cài file APK lên điện thoại thật lại bị Google Play Protect báo lỗi hoặc bị chặn?</w:t>
       </w:r>
@@ -3164,13 +3132,13 @@
       <w:pPr>
         <w:pStyle w:val="Heading2"/>
         <w:keepNext/>
-        <w:spacing w:before="240" w:after="120"/>
+        <w:spacing w:before="280" w:after="120"/>
       </w:pPr>
       <w:r>
         <w:rPr>
           <w:b/>
-          <w:color w:val="2A52BE"/>
-          <w:sz w:val="26"/>
+          <w:color w:val="2563EB"/>
+          <w:sz w:val="25"/>
         </w:rPr>
         <w:t>Câu 2: Tài khoản Admin và tài khoản bình thường khác nhau chỗ nào? Chế độ 'Bỏ qua đăng nhập' khác các tài khoản đã đăng ký như thế nào? Cần tạo tài khoản để làm gì?</w:t>
       </w:r>
@@ -3198,13 +3166,13 @@
       <w:pPr>
         <w:pStyle w:val="Heading2"/>
         <w:keepNext/>
-        <w:spacing w:before="240" w:after="120"/>
+        <w:spacing w:before="280" w:after="120"/>
       </w:pPr>
       <w:r>
         <w:rPr>
           <w:b/>
-          <w:color w:val="2A52BE"/>
-          <w:sz w:val="26"/>
+          <w:color w:val="2563EB"/>
+          <w:sz w:val="25"/>
         </w:rPr>
         <w:t>Câu 3: Các tài khoản đã đăng ký được lưu ở đâu? Tài khoản admin có thể xóa các tài khoản bình thường không? Tài khoản admin có xem được mật khẩu của tài khoản khác không?</w:t>
       </w:r>
@@ -3226,13 +3194,13 @@
       <w:pPr>
         <w:pStyle w:val="Heading2"/>
         <w:keepNext/>
-        <w:spacing w:before="240" w:after="120"/>
+        <w:spacing w:before="280" w:after="120"/>
       </w:pPr>
       <w:r>
         <w:rPr>
           <w:b/>
-          <w:color w:val="2A52BE"/>
-          <w:sz w:val="26"/>
+          <w:color w:val="2563EB"/>
+          <w:sz w:val="25"/>
         </w:rPr>
         <w:t>Câu 4: Dữ liệu thời tiết lấy ở đâu? Nguồn có uy tín không?</w:t>
       </w:r>
@@ -3252,13 +3220,13 @@
       <w:pPr>
         <w:pStyle w:val="Heading2"/>
         <w:keepNext/>
-        <w:spacing w:before="240" w:after="120"/>
+        <w:spacing w:before="280" w:after="120"/>
       </w:pPr>
       <w:r>
         <w:rPr>
           <w:b/>
-          <w:color w:val="2A52BE"/>
-          <w:sz w:val="26"/>
+          <w:color w:val="2563EB"/>
+          <w:sz w:val="25"/>
         </w:rPr>
         <w:t>Câu 5: Dữ liệu được lưu vào đâu? Lưu như thế nào? Lưu tạm thời hay lưu vĩnh viễn?</w:t>
       </w:r>
@@ -3282,13 +3250,13 @@
       <w:pPr>
         <w:pStyle w:val="Heading2"/>
         <w:keepNext/>
-        <w:spacing w:before="240" w:after="120"/>
+        <w:spacing w:before="280" w:after="120"/>
       </w:pPr>
       <w:r>
         <w:rPr>
           <w:b/>
-          <w:color w:val="2A52BE"/>
-          <w:sz w:val="26"/>
+          <w:color w:val="2563EB"/>
+          <w:sz w:val="25"/>
         </w:rPr>
         <w:t>Câu 6: Các chỉ số độ ẩm không khí, sức gió, UV, điểm sương, bụi AQI là tự tính hay lấy từ API? Gợi ý đời sống tự tính thế nào?</w:t>
       </w:r>
@@ -3308,13 +3276,13 @@
       <w:pPr>
         <w:pStyle w:val="Heading2"/>
         <w:keepNext/>
-        <w:spacing w:before="240" w:after="120"/>
+        <w:spacing w:before="280" w:after="120"/>
       </w:pPr>
       <w:r>
         <w:rPr>
           <w:b/>
-          <w:color w:val="2A52BE"/>
-          <w:sz w:val="26"/>
+          <w:color w:val="2563EB"/>
+          <w:sz w:val="25"/>
         </w:rPr>
         <w:t>Câu 7: Định vị GPS hoạt động kiểu gì? Làm sao để đảm bảo đúng, không bị lỗi tên thôn xóm lạ (như Đình Thôn hay Xóm Trong)?</w:t>
       </w:r>
@@ -3334,13 +3302,13 @@
       <w:pPr>
         <w:pStyle w:val="Heading2"/>
         <w:keepNext/>
-        <w:spacing w:before="240" w:after="120"/>
+        <w:spacing w:before="280" w:after="120"/>
       </w:pPr>
       <w:r>
         <w:rPr>
           <w:b/>
-          <w:color w:val="2A52BE"/>
-          <w:sz w:val="26"/>
+          <w:color w:val="2563EB"/>
+          <w:sz w:val="25"/>
         </w:rPr>
         <w:t>Câu 8: So sánh thời tiết giữa 2 khu vực có tác dụng thực tế gì?</w:t>
       </w:r>
@@ -3360,13 +3328,13 @@
       <w:pPr>
         <w:pStyle w:val="Heading2"/>
         <w:keepNext/>
-        <w:spacing w:before="240" w:after="120"/>
+        <w:spacing w:before="280" w:after="120"/>
       </w:pPr>
       <w:r>
         <w:rPr>
           <w:b/>
-          <w:color w:val="2A52BE"/>
-          <w:sz w:val="26"/>
+          <w:color w:val="2563EB"/>
+          <w:sz w:val="25"/>
         </w:rPr>
         <w:t>Câu 9: Các màn hình liên kết với nhau bằng cách nào trong mã nguồn Java? Dòng code cụ thể?</w:t>
       </w:r>
@@ -3388,15 +3356,15 @@
       <w:pPr>
         <w:pStyle w:val="Heading1"/>
         <w:keepNext/>
-        <w:spacing w:before="240" w:after="120"/>
+        <w:spacing w:before="280" w:after="120"/>
       </w:pPr>
       <w:r>
         <w:rPr>
           <w:b/>
           <w:color w:val="1B365D"/>
-          <w:sz w:val="32"/>
+          <w:sz w:val="30"/>
         </w:rPr>
-        <w:t>PHẦN V: HƯỚNG DẪN CÀI ĐẶT TRÊN ĐIỆN THOẠI &amp; LIÊN KẾT TẢI APP</w:t>
+        <w:t>CHƯƠNG V: HƯỚNG DẪN CÀI ĐẶT TRÊN ĐIỆN THOẠI &amp; LIÊN KẾT TÀI NGUYÊN</w:t>
       </w:r>
     </w:p>
     <w:p>
@@ -3442,13 +3410,13 @@
       <w:pPr>
         <w:pStyle w:val="Heading2"/>
         <w:keepNext/>
-        <w:spacing w:before="240" w:after="120"/>
+        <w:spacing w:before="280" w:after="120"/>
       </w:pPr>
       <w:r>
         <w:rPr>
           <w:b/>
-          <w:color w:val="2A52BE"/>
-          <w:sz w:val="26"/>
+          <w:color w:val="2563EB"/>
+          <w:sz w:val="25"/>
         </w:rPr>
         <w:t>2. Hướng dẫn cách tải và cài đặt trực tiếp trên điện thoại Android:</w:t>
       </w:r>
@@ -3546,13 +3514,13 @@
       <w:pPr>
         <w:pStyle w:val="Heading2"/>
         <w:keepNext/>
-        <w:spacing w:before="240" w:after="120"/>
+        <w:spacing w:before="280" w:after="120"/>
       </w:pPr>
       <w:r>
         <w:rPr>
           <w:b/>
-          <w:color w:val="2A52BE"/>
-          <w:sz w:val="26"/>
+          <w:color w:val="2563EB"/>
+          <w:sz w:val="25"/>
         </w:rPr>
         <w:t>3. Hướng dẫn sử dụng cho điện thoại iPhone (iOS):</w:t>
       </w:r>
@@ -3598,7 +3566,7 @@
     </w:p>
     <w:sectPr>
       <w:pgSz w:w="12240" w:h="15840"/>
-      <w:pgMar w:top="1152" w:right="1296" w:bottom="1152" w:left="1296" w:header="720" w:footer="720" w:gutter="0"/>
+      <w:pgMar w:top="1152" w:right="1224" w:bottom="1152" w:left="1224" w:header="720" w:footer="720" w:gutter="0"/>
       <w:cols w:space="720"/>
       <w:docGrid w:linePitch="360"/>
     </w:sectPr>
@@ -3970,7 +3938,7 @@
     <w:qFormat/>
     <w:rsid w:val="00FC693F"/>
     <w:pPr>
-      <w:spacing w:line="288" w:lineRule="auto" w:after="80"/>
+      <w:spacing w:line="300" w:lineRule="auto" w:after="80"/>
     </w:pPr>
     <w:rPr>
       <w:rFonts w:ascii="Arial" w:hAnsi="Arial"/>

</xml_diff>